<commit_message>
Format the Outfitter Guide docx for print
tools/build_guide_docx.py builds it from the markdown with pandoc and a styled
reference document: title page, table of contents, one section per page,
shaded table headers that repeat across pages, code and callout styling,
screenshots fitted to the page, and a versioned page-number footer.

Co-Authored-By: Claude Opus 5.5 (1M context) <noreply@anthropic.com>
</commit_message>
<xml_diff>
--- a/Outfitter Guide.docx
+++ b/Outfitter Guide.docx
@@ -2,15 +2,59 @@
 <file path=word/document.xml><?xml version="1.0" encoding="utf-8"?>
 <w:document xmlns:w="http://schemas.openxmlformats.org/wordprocessingml/2006/main" xmlns:m="http://schemas.openxmlformats.org/officeDocument/2006/math" xmlns:r="http://schemas.openxmlformats.org/officeDocument/2006/relationships" xmlns:o="urn:schemas-microsoft-com:office:office" xmlns:v="urn:schemas-microsoft-com:vml" xmlns:w10="urn:schemas-microsoft-com:office:word" xmlns:a="http://schemas.openxmlformats.org/drawingml/2006/main" xmlns:pic="http://schemas.openxmlformats.org/drawingml/2006/picture" xmlns:wp="http://schemas.openxmlformats.org/drawingml/2006/wordprocessingDrawing">
   <w:body>
-    <w:bookmarkStart w:id="49" w:name="outfitter-guide"/>
-    <w:p>
-      <w:pPr>
-        <w:pStyle w:val="Heading1"/>
+    <w:p>
+      <w:pPr>
+        <w:pStyle w:val="Title"/>
       </w:pPr>
       <w:r>
         <w:t xml:space="preserve">Outfitter Guide</w:t>
       </w:r>
     </w:p>
+    <w:p>
+      <w:pPr>
+        <w:pStyle w:val="Subtitle"/>
+      </w:pPr>
+      <w:r>
+        <w:t xml:space="preserve">Maya 2026 clothing tool  ·  Version 1.3.0</w:t>
+      </w:r>
+    </w:p>
+    <w:p>
+      <w:pPr>
+        <w:pStyle w:val="Date"/>
+      </w:pPr>
+      <w:r>
+        <w:t xml:space="preserve">October 2026</w:t>
+      </w:r>
+      <w:r>
+        <w:br w:type="page"/>
+      </w:r>
+    </w:p>
+    <w:sdt>
+      <w:sdtPr>
+        <w:docPartObj>
+          <w:docPartGallery w:val="Table of Contents"/>
+          <w:docPartUnique/>
+        </w:docPartObj>
+      </w:sdtPr>
+      <w:sdtContent>
+        <w:p>
+          <w:pPr>
+            <w:pStyle w:val="TOCHeading"/>
+          </w:pPr>
+          <w:r>
+            <w:t xml:space="preserve">Contents</w:t>
+          </w:r>
+        </w:p>
+        <w:p>
+          <w:r>
+            <w:fldChar w:fldCharType="begin" w:dirty="true"/>
+            <w:instrText xml:space="preserve">TOC \o "1-2" \h \z \u</w:instrText>
+            <w:fldChar w:fldCharType="separate"/>
+            <w:fldChar w:fldCharType="end"/>
+          </w:r>
+        </w:p>
+      </w:sdtContent>
+    </w:sdt>
     <w:p>
       <w:pPr>
         <w:pStyle w:val="FirstParagraph"/>
@@ -137,10 +181,10 @@
         </w:pict>
       </w:r>
     </w:p>
-    <w:bookmarkStart w:id="9" w:name="how-it-works"/>
-    <w:p>
-      <w:pPr>
-        <w:pStyle w:val="Heading2"/>
+    <w:bookmarkStart w:id="18" w:name="Xbddab8ab2cae33bfaa84bc765b80be39e4ef3dc"/>
+    <w:p>
+      <w:pPr>
+        <w:pStyle w:val="Heading1"/>
       </w:pPr>
       <w:r>
         <w:t xml:space="preserve">1. How it works</w:t>
@@ -151,7 +195,7 @@
         <w:pStyle w:val="FirstParagraph"/>
       </w:pPr>
       <w:r>
-        <w:t xml:space="preserve">Every garment is a mesh skinned to its own copy of the rig’s skeleton - the</w:t>
+        <w:t xml:space="preserve">Every garment is a mesh skinned to its own copy of the rig's skeleton - the</w:t>
       </w:r>
       <w:r>
         <w:t xml:space="preserve"> </w:t>
@@ -221,7 +265,7 @@
         <w:t xml:space="preserve">by name</w:t>
       </w:r>
       <w:r>
-        <w:t xml:space="preserve">. If something doesn’t follow the body, check joint names first.</w:t>
+        <w:t xml:space="preserve">. If something doesn't follow the body, check joint names first.</w:t>
       </w:r>
     </w:p>
     <w:p>
@@ -287,7 +331,10 @@
         </w:numPr>
       </w:pPr>
       <w:r>
-        <w:t xml:space="preserve">You can wear several garments at once. Each one sits in its own namespace (e.g. </w:t>
+        <w:t xml:space="preserve">You can wear several garments at once. Each one sits in its own namespace (e.g.</w:t>
+      </w:r>
+      <w:r>
+        <w:t xml:space="preserve"> </w:t>
       </w:r>
       <w:r>
         <w:rPr>
@@ -346,20 +393,20 @@
         </w:pict>
       </w:r>
     </w:p>
-    <w:bookmarkEnd w:id="9"/>
-    <w:bookmarkStart w:id="16" w:name="install-and-setup"/>
+    <w:bookmarkEnd w:id="18"/>
+    <w:bookmarkStart w:id="25" w:name="X683f3037a27c9b258b97a74e80a347d029c9469"/>
+    <w:p>
+      <w:pPr>
+        <w:pStyle w:val="Heading1"/>
+      </w:pPr>
+      <w:r>
+        <w:t xml:space="preserve">2. Install and setup</w:t>
+      </w:r>
+    </w:p>
+    <w:bookmarkStart w:id="19" w:name="install"/>
     <w:p>
       <w:pPr>
         <w:pStyle w:val="Heading2"/>
-      </w:pPr>
-      <w:r>
-        <w:t xml:space="preserve">2. Install and setup</w:t>
-      </w:r>
-    </w:p>
-    <w:bookmarkStart w:id="10" w:name="install"/>
-    <w:p>
-      <w:pPr>
-        <w:pStyle w:val="Heading3"/>
       </w:pPr>
       <w:r>
         <w:t xml:space="preserve">Install</w:t>
@@ -529,11 +576,11 @@
         <w:t xml:space="preserve">assets and library folders are kept.</w:t>
       </w:r>
     </w:p>
-    <w:bookmarkEnd w:id="10"/>
-    <w:bookmarkStart w:id="14" w:name="point-it-at-your-library-setup-tab"/>
-    <w:p>
-      <w:pPr>
-        <w:pStyle w:val="Heading3"/>
+    <w:bookmarkEnd w:id="19"/>
+    <w:bookmarkStart w:id="23" w:name="point-it-at-your-library-setup-tab"/>
+    <w:p>
+      <w:pPr>
+        <w:pStyle w:val="Heading2"/>
       </w:pPr>
       <w:r>
         <w:t xml:space="preserve">Point it at your library (Setup tab)</w:t>
@@ -729,25 +776,25 @@
     </w:p>
     <w:p>
       <w:pPr>
-        <w:pStyle w:val="CaptionedFigure"/>
+        <w:pStyle w:val="FirstParagraph"/>
       </w:pPr>
       <w:r>
         <w:drawing>
           <wp:inline>
-            <wp:extent cx="5334000" cy="1220491"/>
+            <wp:extent cx="5349240" cy="1223978"/>
             <wp:effectExtent b="0" l="0" r="0" t="0"/>
-            <wp:docPr descr="The Setup tab, with the local and remote library folders set" title="" id="12" name="Picture"/>
+            <wp:docPr descr="The Setup tab, with the local and remote library folders set" title="" id="21" name="Picture"/>
             <a:graphic>
               <a:graphicData uri="http://schemas.openxmlformats.org/drawingml/2006/picture">
                 <pic:pic>
                   <pic:nvPicPr>
-                    <pic:cNvPr descr="docs/images/setup.png" id="13" name="Picture"/>
+                    <pic:cNvPr descr="docs/images/setup.png" id="22" name="Picture"/>
                     <pic:cNvPicPr>
                       <a:picLocks noChangeArrowheads="1" noChangeAspect="1"/>
                     </pic:cNvPicPr>
                   </pic:nvPicPr>
                   <pic:blipFill>
-                    <a:blip r:embed="rId11"/>
+                    <a:blip r:embed="rId20"/>
                     <a:stretch>
                       <a:fillRect/>
                     </a:stretch>
@@ -755,7 +802,7 @@
                   <pic:spPr bwMode="auto">
                     <a:xfrm>
                       <a:off x="0" y="0"/>
-                      <a:ext cx="5334000" cy="1220491"/>
+                      <a:ext cx="5349240" cy="1223978"/>
                     </a:xfrm>
                     <a:prstGeom prst="rect">
                       <a:avLst/>
@@ -776,14 +823,6 @@
     </w:p>
     <w:p>
       <w:pPr>
-        <w:pStyle w:val="ImageCaption"/>
-      </w:pPr>
-      <w:r>
-        <w:t xml:space="preserve">The Setup tab, with the local and remote library folders set</w:t>
-      </w:r>
-    </w:p>
-    <w:p>
-      <w:pPr>
         <w:pStyle w:val="BodyText"/>
       </w:pPr>
       <w:r>
@@ -809,14 +848,14 @@
         <w:t xml:space="preserve"> </w:t>
       </w:r>
       <w:r>
-        <w:t xml:space="preserve">isn’t reachable right now, usually because the drive or server isn’t mounted.</w:t>
-      </w:r>
-    </w:p>
-    <w:bookmarkEnd w:id="14"/>
-    <w:bookmarkStart w:id="15" w:name="sync-from-the-master-library"/>
-    <w:p>
-      <w:pPr>
-        <w:pStyle w:val="Heading3"/>
+        <w:t xml:space="preserve">isn't reachable right now, usually because the drive or server isn't mounted.</w:t>
+      </w:r>
+    </w:p>
+    <w:bookmarkEnd w:id="23"/>
+    <w:bookmarkStart w:id="24" w:name="sync-from-the-master-library"/>
+    <w:p>
+      <w:pPr>
+        <w:pStyle w:val="Heading2"/>
       </w:pPr>
       <w:r>
         <w:t xml:space="preserve">Sync from the master library</w:t>
@@ -944,14 +983,17 @@
         <w:pStyle w:val="FirstParagraph"/>
       </w:pPr>
       <w:r>
-        <w:t xml:space="preserve">You get a one-line summary (e.g. </w:t>
+        <w:t xml:space="preserve">You get a one-line summary (e.g.</w:t>
+      </w:r>
+      <w:r>
+        <w:t xml:space="preserve"> </w:t>
       </w:r>
       <w:r>
         <w:rPr>
           <w:i/>
           <w:iCs/>
         </w:rPr>
-        <w:t xml:space="preserve">“Sync complete - 3 added, 1 updated, 12 up to date.”</w:t>
+        <w:t xml:space="preserve">"Sync complete - 3 added, 1 updated, 12 up to date."</w:t>
       </w:r>
       <w:r>
         <w:t xml:space="preserve">)</w:t>
@@ -986,104 +1028,95 @@
         </w:pict>
       </w:r>
     </w:p>
-    <w:bookmarkEnd w:id="15"/>
-    <w:bookmarkEnd w:id="16"/>
-    <w:bookmarkStart w:id="21" w:name="working-with-rigs"/>
+    <w:bookmarkEnd w:id="24"/>
+    <w:bookmarkEnd w:id="25"/>
+    <w:bookmarkStart w:id="30" w:name="Xbdd5f438c0ef4da14292d069985c0bf8d701989"/>
+    <w:p>
+      <w:pPr>
+        <w:pStyle w:val="Heading1"/>
+      </w:pPr>
+      <w:r>
+        <w:t xml:space="preserve">3. Working with rigs</w:t>
+      </w:r>
+    </w:p>
+    <w:p>
+      <w:pPr>
+        <w:pStyle w:val="FirstParagraph"/>
+      </w:pPr>
+      <w:r>
+        <w:t xml:space="preserve">At the top of the</w:t>
+      </w:r>
+      <w:r>
+        <w:t xml:space="preserve"> </w:t>
+      </w:r>
+      <w:r>
+        <w:rPr>
+          <w:b/>
+          <w:bCs/>
+        </w:rPr>
+        <w:t xml:space="preserve">Library</w:t>
+      </w:r>
+      <w:r>
+        <w:t xml:space="preserve"> </w:t>
+      </w:r>
+      <w:r>
+        <w:t xml:space="preserve">and</w:t>
+      </w:r>
+      <w:r>
+        <w:t xml:space="preserve"> </w:t>
+      </w:r>
+      <w:r>
+        <w:rPr>
+          <w:b/>
+          <w:bCs/>
+        </w:rPr>
+        <w:t xml:space="preserve">Publish</w:t>
+      </w:r>
+      <w:r>
+        <w:t xml:space="preserve"> </w:t>
+      </w:r>
+      <w:r>
+        <w:t xml:space="preserve">tabs is a</w:t>
+      </w:r>
+      <w:r>
+        <w:t xml:space="preserve"> </w:t>
+      </w:r>
+      <w:r>
+        <w:rPr>
+          <w:b/>
+          <w:bCs/>
+        </w:rPr>
+        <w:t xml:space="preserve">Rig</w:t>
+      </w:r>
+      <w:r>
+        <w:t xml:space="preserve"> </w:t>
+      </w:r>
+      <w:r>
+        <w:t xml:space="preserve">dropdown. It answers "which</w:t>
+      </w:r>
+      <w:r>
+        <w:t xml:space="preserve"> </w:t>
+      </w:r>
+      <w:r>
+        <w:t xml:space="preserve">character am I working with?", and everything follows from it: the Library shows clothing</w:t>
+      </w:r>
+      <w:r>
+        <w:t xml:space="preserve"> </w:t>
+      </w:r>
+      <w:r>
+        <w:t xml:space="preserve">for that rig, and Publish tags what you make with it. Your choice is remembered between</w:t>
+      </w:r>
+      <w:r>
+        <w:t xml:space="preserve"> </w:t>
+      </w:r>
+      <w:r>
+        <w:t xml:space="preserve">sessions.</w:t>
+      </w:r>
+    </w:p>
+    <w:bookmarkStart w:id="26" w:name="register-a-new-rig"/>
     <w:p>
       <w:pPr>
         <w:pStyle w:val="Heading2"/>
-      </w:pPr>
-      <w:r>
-        <w:t xml:space="preserve">3. Working with rigs</w:t>
-      </w:r>
-    </w:p>
-    <w:p>
-      <w:pPr>
-        <w:pStyle w:val="FirstParagraph"/>
-      </w:pPr>
-      <w:r>
-        <w:t xml:space="preserve">At the top of the</w:t>
-      </w:r>
-      <w:r>
-        <w:t xml:space="preserve"> </w:t>
-      </w:r>
-      <w:r>
-        <w:rPr>
-          <w:b/>
-          <w:bCs/>
-        </w:rPr>
-        <w:t xml:space="preserve">Library</w:t>
-      </w:r>
-      <w:r>
-        <w:t xml:space="preserve"> </w:t>
-      </w:r>
-      <w:r>
-        <w:t xml:space="preserve">and</w:t>
-      </w:r>
-      <w:r>
-        <w:t xml:space="preserve"> </w:t>
-      </w:r>
-      <w:r>
-        <w:rPr>
-          <w:b/>
-          <w:bCs/>
-        </w:rPr>
-        <w:t xml:space="preserve">Publish</w:t>
-      </w:r>
-      <w:r>
-        <w:t xml:space="preserve"> </w:t>
-      </w:r>
-      <w:r>
-        <w:t xml:space="preserve">tabs is a</w:t>
-      </w:r>
-      <w:r>
-        <w:t xml:space="preserve"> </w:t>
-      </w:r>
-      <w:r>
-        <w:rPr>
-          <w:b/>
-          <w:bCs/>
-        </w:rPr>
-        <w:t xml:space="preserve">Rig</w:t>
-      </w:r>
-      <w:r>
-        <w:t xml:space="preserve"> </w:t>
-      </w:r>
-      <w:r>
-        <w:t xml:space="preserve">dropdown. It answers</w:t>
-      </w:r>
-      <w:r>
-        <w:t xml:space="preserve"> </w:t>
-      </w:r>
-      <w:r>
-        <w:t xml:space="preserve">“which</w:t>
-      </w:r>
-      <w:r>
-        <w:t xml:space="preserve"> </w:t>
-      </w:r>
-      <w:r>
-        <w:t xml:space="preserve">character am I working with?”</w:t>
-      </w:r>
-      <w:r>
-        <w:t xml:space="preserve">, and everything follows from it: the Library shows clothing</w:t>
-      </w:r>
-      <w:r>
-        <w:t xml:space="preserve"> </w:t>
-      </w:r>
-      <w:r>
-        <w:t xml:space="preserve">for that rig, and Publish tags what you make with it. Your choice is remembered between</w:t>
-      </w:r>
-      <w:r>
-        <w:t xml:space="preserve"> </w:t>
-      </w:r>
-      <w:r>
-        <w:t xml:space="preserve">sessions.</w:t>
-      </w:r>
-    </w:p>
-    <w:bookmarkStart w:id="17" w:name="register-a-new-rig"/>
-    <w:p>
-      <w:pPr>
-        <w:pStyle w:val="Heading3"/>
       </w:pPr>
       <w:r>
         <w:t xml:space="preserve">Register a new rig</w:t>
@@ -1271,7 +1304,7 @@
         <w:t xml:space="preserve"> </w:t>
       </w:r>
       <w:r>
-        <w:t xml:space="preserve">Confirm it’s the rig itself and not the scene you imported it into.</w:t>
+        <w:t xml:space="preserve">Confirm it's the rig itself and not the scene you imported it into.</w:t>
       </w:r>
     </w:p>
     <w:p>
@@ -1320,11 +1353,11 @@
         <w:t xml:space="preserve">.</w:t>
       </w:r>
     </w:p>
-    <w:bookmarkEnd w:id="17"/>
-    <w:bookmarkStart w:id="18" w:name="fetch-a-rig-body"/>
-    <w:p>
-      <w:pPr>
-        <w:pStyle w:val="Heading3"/>
+    <w:bookmarkEnd w:id="26"/>
+    <w:bookmarkStart w:id="27" w:name="fetch-a-rig-body"/>
+    <w:p>
+      <w:pPr>
+        <w:pStyle w:val="Heading2"/>
       </w:pPr>
       <w:r>
         <w:t xml:space="preserve">Fetch a rig body</w:t>
@@ -1335,13 +1368,13 @@
         <w:pStyle w:val="FirstParagraph"/>
       </w:pPr>
       <w:r>
-        <w:t xml:space="preserve">Rig files are big, so Sync doesn’t copy them to every machine (it copies only the small rig</w:t>
-      </w:r>
-      <w:r>
-        <w:t xml:space="preserve"> </w:t>
-      </w:r>
-      <w:r>
-        <w:t xml:space="preserve">profiles). Beside the rig dropdown you’ll see where the body is:</w:t>
+        <w:t xml:space="preserve">Rig files are big, so Sync doesn't copy them to every machine (it copies only the small rig</w:t>
+      </w:r>
+      <w:r>
+        <w:t xml:space="preserve"> </w:t>
+      </w:r>
+      <w:r>
+        <w:t xml:space="preserve">profiles). Beside the rig dropdown you'll see where the body is:</w:t>
       </w:r>
       <w:r>
         <w:t xml:space="preserve"> </w:t>
@@ -1406,11 +1439,11 @@
         <w:t xml:space="preserve">. Just picking a rig never downloads anything.</w:t>
       </w:r>
     </w:p>
-    <w:bookmarkEnd w:id="18"/>
-    <w:bookmarkStart w:id="19" w:name="rigs-and-versions"/>
-    <w:p>
-      <w:pPr>
-        <w:pStyle w:val="Heading3"/>
+    <w:bookmarkEnd w:id="27"/>
+    <w:bookmarkStart w:id="28" w:name="rigs-and-versions"/>
+    <w:p>
+      <w:pPr>
+        <w:pStyle w:val="Heading2"/>
       </w:pPr>
       <w:r>
         <w:t xml:space="preserve">Rigs and versions</w:t>
@@ -1437,7 +1470,7 @@
         <w:t xml:space="preserve"> </w:t>
       </w:r>
       <w:r>
-        <w:t xml:space="preserve">(which rig it’s built for) and the</w:t>
+        <w:t xml:space="preserve">(which rig it's built for) and the</w:t>
       </w:r>
       <w:r>
         <w:t xml:space="preserve"> </w:t>
@@ -1471,7 +1504,7 @@
         <w:t xml:space="preserve"> </w:t>
       </w:r>
       <w:r>
-        <w:t xml:space="preserve">deform into nonsense. If the scene’s rig version can’t be detected, the version check is</w:t>
+        <w:t xml:space="preserve">deform into nonsense. If the scene's rig version can't be detected, the version check is</w:t>
       </w:r>
       <w:r>
         <w:t xml:space="preserve"> </w:t>
@@ -1485,7 +1518,7 @@
         <w:pStyle w:val="BodyText"/>
       </w:pPr>
       <w:r>
-        <w:t xml:space="preserve">Assets published before Outfitter supported multiple rigs carry no rig ID; they’re read as</w:t>
+        <w:t xml:space="preserve">Assets published before Outfitter supported multiple rigs carry no rig ID; they're read as</w:t>
       </w:r>
       <w:r>
         <w:t xml:space="preserve"> </w:t>
@@ -1516,11 +1549,11 @@
         <w:t xml:space="preserve">that identity into them explicitly.</w:t>
       </w:r>
     </w:p>
-    <w:bookmarkEnd w:id="19"/>
-    <w:bookmarkStart w:id="20" w:name="use-a-garment-on-a-different-rig"/>
-    <w:p>
-      <w:pPr>
-        <w:pStyle w:val="Heading3"/>
+    <w:bookmarkEnd w:id="28"/>
+    <w:bookmarkStart w:id="29" w:name="use-a-garment-on-a-different-rig"/>
+    <w:p>
+      <w:pPr>
+        <w:pStyle w:val="Heading2"/>
       </w:pPr>
       <w:r>
         <w:t xml:space="preserve">Use a garment on a different rig</w:t>
@@ -1531,7 +1564,7 @@
         <w:pStyle w:val="FirstParagraph"/>
       </w:pPr>
       <w:r>
-        <w:t xml:space="preserve">A garment is skinned to one rig’s skeleton, so it can’t simply be attached to another.</w:t>
+        <w:t xml:space="preserve">A garment is skinned to one rig's skeleton, so it can't simply be attached to another.</w:t>
       </w:r>
       <w:r>
         <w:t xml:space="preserve"> </w:t>
@@ -1556,7 +1589,7 @@
         <w:t xml:space="preserve"> </w:t>
       </w:r>
       <w:r>
-        <w:t xml:space="preserve">renames its joints to the new rig’s, and moves them onto the new rest pose</w:t>
+        <w:t xml:space="preserve">renames its joints to the new rig's, and moves them onto the new rest pose</w:t>
       </w:r>
       <w:r>
         <w:t xml:space="preserve"> </w:t>
@@ -1583,7 +1616,7 @@
         <w:t xml:space="preserve">disturbing your skin weights</w:t>
       </w:r>
       <w:r>
-        <w:t xml:space="preserve">. It shows you anything it couldn’t map before it starts.</w:t>
+        <w:t xml:space="preserve">. It shows you anything it couldn't map before it starts.</w:t>
       </w:r>
     </w:p>
     <w:p>
@@ -1613,12 +1646,12 @@
         </w:pict>
       </w:r>
     </w:p>
-    <w:bookmarkEnd w:id="20"/>
-    <w:bookmarkEnd w:id="21"/>
-    <w:bookmarkStart w:id="26" w:name="dress-a-character-library-tab"/>
-    <w:p>
-      <w:pPr>
-        <w:pStyle w:val="Heading2"/>
+    <w:bookmarkEnd w:id="29"/>
+    <w:bookmarkEnd w:id="30"/>
+    <w:bookmarkStart w:id="35" w:name="Xb4a3f10933b307b3672f47b355ebe76ae9b5c4d"/>
+    <w:p>
+      <w:pPr>
+        <w:pStyle w:val="Heading1"/>
       </w:pPr>
       <w:r>
         <w:t xml:space="preserve">4. Dress a character (Library tab)</w:t>
@@ -1650,25 +1683,25 @@
     </w:p>
     <w:p>
       <w:pPr>
-        <w:pStyle w:val="CaptionedFigure"/>
+        <w:pStyle w:val="BodyText"/>
       </w:pPr>
       <w:r>
         <w:drawing>
           <wp:inline>
-            <wp:extent cx="5334000" cy="4298842"/>
+            <wp:extent cx="5349240" cy="4311124"/>
             <wp:effectExtent b="0" l="0" r="0" t="0"/>
-            <wp:docPr descr="The Library tab with the starter trench coat selected and its details on the right" title="" id="23" name="Picture"/>
+            <wp:docPr descr="The Library tab with the starter trench coat selected and its details on the right" title="" id="32" name="Picture"/>
             <a:graphic>
               <a:graphicData uri="http://schemas.openxmlformats.org/drawingml/2006/picture">
                 <pic:pic>
                   <pic:nvPicPr>
-                    <pic:cNvPr descr="docs/images/library.png" id="24" name="Picture"/>
+                    <pic:cNvPr descr="docs/images/library.png" id="33" name="Picture"/>
                     <pic:cNvPicPr>
                       <a:picLocks noChangeArrowheads="1" noChangeAspect="1"/>
                     </pic:cNvPicPr>
                   </pic:nvPicPr>
                   <pic:blipFill>
-                    <a:blip r:embed="rId22"/>
+                    <a:blip r:embed="rId31"/>
                     <a:stretch>
                       <a:fillRect/>
                     </a:stretch>
@@ -1676,7 +1709,7 @@
                   <pic:spPr bwMode="auto">
                     <a:xfrm>
                       <a:off x="0" y="0"/>
-                      <a:ext cx="5334000" cy="4298842"/>
+                      <a:ext cx="5349240" cy="4311124"/>
                     </a:xfrm>
                     <a:prstGeom prst="rect">
                       <a:avLst/>
@@ -1697,14 +1730,6 @@
     </w:p>
     <w:p>
       <w:pPr>
-        <w:pStyle w:val="ImageCaption"/>
-      </w:pPr>
-      <w:r>
-        <w:t xml:space="preserve">The Library tab with the starter trench coat selected and its details on the right</w:t>
-      </w:r>
-    </w:p>
-    <w:p>
-      <w:pPr>
         <w:pStyle w:val="Compact"/>
         <w:numPr>
           <w:ilvl w:val="0"/>
@@ -1788,7 +1813,7 @@
         <w:t xml:space="preserve"> </w:t>
       </w:r>
       <w:r>
-        <w:t xml:space="preserve">brings it into view (greyed out, since it can’t be attached here).</w:t>
+        <w:t xml:space="preserve">brings it into view (greyed out, since it can't be attached here).</w:t>
       </w:r>
     </w:p>
     <w:p>
@@ -1913,7 +1938,7 @@
         <w:t xml:space="preserve"> </w:t>
       </w:r>
       <w:r>
-        <w:t xml:space="preserve">the garment’s namespace.</w:t>
+        <w:t xml:space="preserve">the garment's namespace.</w:t>
       </w:r>
     </w:p>
     <w:p>
@@ -1964,7 +1989,7 @@
         <w:t xml:space="preserve">the scene is left exactly as it was</w:t>
       </w:r>
       <w:r>
-        <w:t xml:space="preserve">. Warnings don’t</w:t>
+        <w:t xml:space="preserve">. Warnings don't</w:t>
       </w:r>
       <w:r>
         <w:t xml:space="preserve"> </w:t>
@@ -1988,7 +2013,7 @@
         <w:t xml:space="preserve"> </w:t>
       </w:r>
       <w:r>
-        <w:t xml:space="preserve">e.g. a shirt, pants and shoes together.</w:t>
+        <w:t xml:space="preserve">e.g. a shirt, pants and shoes together.</w:t>
       </w:r>
     </w:p>
     <w:p>
@@ -2032,10 +2057,10 @@
         <w:t xml:space="preserve">. The rest stay on.</w:t>
       </w:r>
     </w:p>
-    <w:bookmarkStart w:id="25" w:name="male-and-female-variants"/>
-    <w:p>
-      <w:pPr>
-        <w:pStyle w:val="Heading3"/>
+    <w:bookmarkStart w:id="34" w:name="male-and-female-variants"/>
+    <w:p>
+      <w:pPr>
+        <w:pStyle w:val="Heading2"/>
       </w:pPr>
       <w:r>
         <w:t xml:space="preserve">Male and female variants</w:t>
@@ -2046,7 +2071,7 @@
         <w:pStyle w:val="FirstParagraph"/>
       </w:pPr>
       <w:r>
-        <w:t xml:space="preserve">There is no fit step when you attach. A rig’s body morph moves only the body</w:t>
+        <w:t xml:space="preserve">There is no fit step when you attach. A rig's body morph moves only the body</w:t>
       </w:r>
       <w:r>
         <w:t xml:space="preserve"> </w:t>
@@ -2065,7 +2090,7 @@
         <w:t xml:space="preserve"> </w:t>
       </w:r>
       <w:r>
-        <w:t xml:space="preserve">the joints, so a single garment can’t follow the difference between the male and female</w:t>
+        <w:t xml:space="preserve">the joints, so a single garment can't follow the difference between the male and female</w:t>
       </w:r>
       <w:r>
         <w:t xml:space="preserve"> </w:t>
@@ -2083,7 +2108,7 @@
         <w:t xml:space="preserve"> </w:t>
       </w:r>
       <w:r>
-        <w:t xml:space="preserve">the body you’re dressing. A rig with a single body has no variants, and its assets record</w:t>
+        <w:t xml:space="preserve">the body you're dressing. A rig with a single body has no variants, and its assets record</w:t>
       </w:r>
       <w:r>
         <w:t xml:space="preserve"> </w:t>
@@ -2111,15 +2136,67 @@
         </w:pict>
       </w:r>
     </w:p>
-    <w:bookmarkEnd w:id="25"/>
-    <w:bookmarkEnd w:id="26"/>
-    <w:bookmarkStart w:id="35" w:name="make-a-garment-publish-tab"/>
+    <w:bookmarkEnd w:id="34"/>
+    <w:bookmarkEnd w:id="35"/>
+    <w:bookmarkStart w:id="44" w:name="X5b2be4baccc4f81ac07373b9c3bd84ee570aeef"/>
+    <w:p>
+      <w:pPr>
+        <w:pStyle w:val="Heading1"/>
+      </w:pPr>
+      <w:r>
+        <w:t xml:space="preserve">5. Make a garment (Publish tab)</w:t>
+      </w:r>
+    </w:p>
+    <w:p>
+      <w:pPr>
+        <w:pStyle w:val="FirstParagraph"/>
+      </w:pPr>
+      <w:r>
+        <w:rPr>
+          <w:b/>
+          <w:bCs/>
+        </w:rPr>
+        <w:t xml:space="preserve">Make in:</w:t>
+      </w:r>
+      <w:r>
+        <w:t xml:space="preserve"> </w:t>
+      </w:r>
+      <w:r>
+        <w:t xml:space="preserve">Maya 2026 ·</w:t>
+      </w:r>
+      <w:r>
+        <w:t xml:space="preserve"> </w:t>
+      </w:r>
+      <w:r>
+        <w:rPr>
+          <w:b/>
+          <w:bCs/>
+        </w:rPr>
+        <w:t xml:space="preserve">Save as:</w:t>
+      </w:r>
+      <w:r>
+        <w:t xml:space="preserve"> </w:t>
+      </w:r>
+      <w:r>
+        <w:t xml:space="preserve">Maya ASCII (</w:t>
+      </w:r>
+      <w:r>
+        <w:rPr>
+          <w:rStyle w:val="VerbatimChar"/>
+        </w:rPr>
+        <w:t xml:space="preserve">.ma</w:t>
+      </w:r>
+      <w:r>
+        <w:t xml:space="preserve">)</w:t>
+      </w:r>
+    </w:p>
+    <w:bookmarkStart w:id="36" w:name="what-youre-making"/>
     <w:p>
       <w:pPr>
         <w:pStyle w:val="Heading2"/>
       </w:pPr>
       <w:r>
-        <w:t xml:space="preserve">5. Make a garment (Publish tab)</w:t>
+        <w:t xml:space="preserve">What you're making</w:t>
       </w:r>
     </w:p>
     <w:p>
@@ -2127,59 +2204,56 @@
         <w:pStyle w:val="FirstParagraph"/>
       </w:pPr>
       <w:r>
-        <w:rPr>
-          <w:b/>
-          <w:bCs/>
-        </w:rPr>
-        <w:t xml:space="preserve">Make in:</w:t>
-      </w:r>
-      <w:r>
-        <w:t xml:space="preserve"> </w:t>
-      </w:r>
-      <w:r>
-        <w:t xml:space="preserve">Maya 2026 ·</w:t>
-      </w:r>
-      <w:r>
-        <w:t xml:space="preserve"> </w:t>
-      </w:r>
-      <w:r>
-        <w:rPr>
-          <w:b/>
-          <w:bCs/>
-        </w:rPr>
-        <w:t xml:space="preserve">Save as:</w:t>
-      </w:r>
-      <w:r>
-        <w:t xml:space="preserve"> </w:t>
-      </w:r>
-      <w:r>
-        <w:t xml:space="preserve">Maya ASCII (</w:t>
+        <w:t xml:space="preserve">A clothing asset is your garment mesh, skinned to the rig's</w:t>
+      </w:r>
+      <w:r>
+        <w:t xml:space="preserve"> </w:t>
       </w:r>
       <w:r>
         <w:rPr>
           <w:rStyle w:val="VerbatimChar"/>
         </w:rPr>
-        <w:t xml:space="preserve">.ma</w:t>
-      </w:r>
-      <w:r>
-        <w:t xml:space="preserve">)</w:t>
-      </w:r>
-    </w:p>
-    <w:bookmarkStart w:id="27" w:name="what-youre-making"/>
-    <w:p>
-      <w:pPr>
-        <w:pStyle w:val="Heading3"/>
-      </w:pPr>
-      <w:r>
-        <w:t xml:space="preserve">What you’re making</w:t>
-      </w:r>
-    </w:p>
-    <w:p>
-      <w:pPr>
-        <w:pStyle w:val="FirstParagraph"/>
-      </w:pPr>
-      <w:r>
-        <w:t xml:space="preserve">A clothing asset is your garment mesh, skinned to the rig’s</w:t>
+        <w:t xml:space="preserve">cloth_*</w:t>
+      </w:r>
+      <w:r>
+        <w:t xml:space="preserve"> </w:t>
+      </w:r>
+      <w:r>
+        <w:t xml:space="preserve">joints, in a clean</w:t>
+      </w:r>
+      <w:r>
+        <w:t xml:space="preserve"> </w:t>
+      </w:r>
+      <w:r>
+        <w:t xml:space="preserve">scene. Outfitter builds the joints and the scene structure for you; your job is the mesh,</w:t>
+      </w:r>
+      <w:r>
+        <w:t xml:space="preserve"> </w:t>
+      </w:r>
+      <w:r>
+        <w:t xml:space="preserve">the skinning, and keeping the scene clean. Make each garment</w:t>
+      </w:r>
+      <w:r>
+        <w:t xml:space="preserve"> </w:t>
+      </w:r>
+      <w:r>
+        <w:rPr>
+          <w:b/>
+          <w:bCs/>
+        </w:rPr>
+        <w:t xml:space="preserve">twice</w:t>
+      </w:r>
+      <w:r>
+        <w:t xml:space="preserve"> </w:t>
+      </w:r>
+      <w:r>
+        <w:t xml:space="preserve">- once on the male</w:t>
+      </w:r>
+      <w:r>
+        <w:t xml:space="preserve"> </w:t>
+      </w:r>
+      <w:r>
+        <w:t xml:space="preserve">body, once on the female body. By convention they're named</w:t>
       </w:r>
       <w:r>
         <w:t xml:space="preserve"> </w:t>
@@ -2188,47 +2262,13 @@
         <w:rPr>
           <w:rStyle w:val="VerbatimChar"/>
         </w:rPr>
-        <w:t xml:space="preserve">cloth_*</w:t>
-      </w:r>
-      <w:r>
-        <w:t xml:space="preserve"> </w:t>
-      </w:r>
-      <w:r>
-        <w:t xml:space="preserve">joints, in a clean</w:t>
-      </w:r>
-      <w:r>
-        <w:t xml:space="preserve"> </w:t>
-      </w:r>
-      <w:r>
-        <w:t xml:space="preserve">scene. Outfitter builds the joints and the scene structure for you; your job is the mesh,</w:t>
-      </w:r>
-      <w:r>
-        <w:t xml:space="preserve"> </w:t>
-      </w:r>
-      <w:r>
-        <w:t xml:space="preserve">the skinning, and keeping the scene clean. Make each garment</w:t>
-      </w:r>
-      <w:r>
-        <w:t xml:space="preserve"> </w:t>
-      </w:r>
-      <w:r>
-        <w:rPr>
-          <w:b/>
-          <w:bCs/>
-        </w:rPr>
-        <w:t xml:space="preserve">twice</w:t>
-      </w:r>
-      <w:r>
-        <w:t xml:space="preserve"> </w:t>
-      </w:r>
-      <w:r>
-        <w:t xml:space="preserve">- once on the male</w:t>
-      </w:r>
-      <w:r>
-        <w:t xml:space="preserve"> </w:t>
-      </w:r>
-      <w:r>
-        <w:t xml:space="preserve">body, once on the female body. By convention they’re named</w:t>
+        <w:t xml:space="preserve">m_&lt;name&gt;</w:t>
+      </w:r>
+      <w:r>
+        <w:t xml:space="preserve"> </w:t>
+      </w:r>
+      <w:r>
+        <w:t xml:space="preserve">and</w:t>
       </w:r>
       <w:r>
         <w:t xml:space="preserve"> </w:t>
@@ -2237,32 +2277,17 @@
         <w:rPr>
           <w:rStyle w:val="VerbatimChar"/>
         </w:rPr>
-        <w:t xml:space="preserve">m_&lt;name&gt;</w:t>
-      </w:r>
-      <w:r>
-        <w:t xml:space="preserve"> </w:t>
-      </w:r>
-      <w:r>
-        <w:t xml:space="preserve">and</w:t>
-      </w:r>
-      <w:r>
-        <w:t xml:space="preserve"> </w:t>
-      </w:r>
-      <w:r>
-        <w:rPr>
-          <w:rStyle w:val="VerbatimChar"/>
-        </w:rPr>
         <w:t xml:space="preserve">f_&lt;name&gt;</w:t>
       </w:r>
       <w:r>
         <w:t xml:space="preserve">.</w:t>
       </w:r>
     </w:p>
-    <w:bookmarkEnd w:id="27"/>
-    <w:bookmarkStart w:id="28" w:name="prep-the-mesh"/>
-    <w:p>
-      <w:pPr>
-        <w:pStyle w:val="Heading3"/>
+    <w:bookmarkEnd w:id="36"/>
+    <w:bookmarkStart w:id="37" w:name="prep-the-mesh"/>
+    <w:p>
+      <w:pPr>
+        <w:pStyle w:val="Heading2"/>
       </w:pPr>
       <w:r>
         <w:t xml:space="preserve">Prep the mesh</w:t>
@@ -2287,7 +2312,7 @@
         <w:t xml:space="preserve"> </w:t>
       </w:r>
       <w:r>
-        <w:t xml:space="preserve">A non-zero pivot height is a handy sign the garment isn’t sitting right on the rig.</w:t>
+        <w:t xml:space="preserve">A non-zero pivot height is a handy sign the garment isn't sitting right on the rig.</w:t>
       </w:r>
     </w:p>
     <w:p>
@@ -2420,11 +2445,11 @@
         <w:t xml:space="preserve">No blendShapes, no nCloth or simulation, no shrinkWrap to the body.</w:t>
       </w:r>
     </w:p>
-    <w:bookmarkEnd w:id="28"/>
-    <w:bookmarkStart w:id="29" w:name="keep-the-scene-clean"/>
-    <w:p>
-      <w:pPr>
-        <w:pStyle w:val="Heading3"/>
+    <w:bookmarkEnd w:id="37"/>
+    <w:bookmarkStart w:id="38" w:name="keep-the-scene-clean"/>
+    <w:p>
+      <w:pPr>
+        <w:pStyle w:val="Heading2"/>
       </w:pPr>
       <w:r>
         <w:t xml:space="preserve">Keep the scene clean</w:t>
@@ -2594,7 +2619,7 @@
         <w:t xml:space="preserve"> </w:t>
       </w:r>
       <w:r>
-        <w:t xml:space="preserve">only, never the body rig’s joints.</w:t>
+        <w:t xml:space="preserve">only, never the body rig's joints.</w:t>
       </w:r>
     </w:p>
     <w:p>
@@ -2628,7 +2653,7 @@
         <w:pStyle w:val="FirstParagraph"/>
       </w:pPr>
       <w:r>
-        <w:t xml:space="preserve">If the body rig is already in the scene when you build, Outfitter can’t tell your geo from</w:t>
+        <w:t xml:space="preserve">If the body rig is already in the scene when you build, Outfitter can't tell your geo from</w:t>
       </w:r>
       <w:r>
         <w:t xml:space="preserve"> </w:t>
@@ -2652,11 +2677,11 @@
         <w:t xml:space="preserve">empty for you to fill.</w:t>
       </w:r>
     </w:p>
-    <w:bookmarkEnd w:id="29"/>
-    <w:bookmarkStart w:id="33" w:name="step-by-step"/>
-    <w:p>
-      <w:pPr>
-        <w:pStyle w:val="Heading3"/>
+    <w:bookmarkEnd w:id="38"/>
+    <w:bookmarkStart w:id="42" w:name="step-by-step"/>
+    <w:p>
+      <w:pPr>
+        <w:pStyle w:val="Heading2"/>
       </w:pPr>
       <w:r>
         <w:t xml:space="preserve">Step by step</w:t>
@@ -2672,25 +2697,25 @@
     </w:p>
     <w:p>
       <w:pPr>
-        <w:pStyle w:val="CaptionedFigure"/>
+        <w:pStyle w:val="BodyText"/>
       </w:pPr>
       <w:r>
         <w:drawing>
           <wp:inline>
-            <wp:extent cx="5334000" cy="4298842"/>
+            <wp:extent cx="5349240" cy="4311124"/>
             <wp:effectExtent b="0" l="0" r="0" t="0"/>
-            <wp:docPr descr="The Publish tab: the five numbered steps, the asset details form, and the log" title="" id="31" name="Picture"/>
+            <wp:docPr descr="The Publish tab: the five numbered steps, the asset details form, and the log" title="" id="40" name="Picture"/>
             <a:graphic>
               <a:graphicData uri="http://schemas.openxmlformats.org/drawingml/2006/picture">
                 <pic:pic>
                   <pic:nvPicPr>
-                    <pic:cNvPr descr="docs/images/publish.png" id="32" name="Picture"/>
+                    <pic:cNvPr descr="docs/images/publish.png" id="41" name="Picture"/>
                     <pic:cNvPicPr>
                       <a:picLocks noChangeArrowheads="1" noChangeAspect="1"/>
                     </pic:cNvPicPr>
                   </pic:nvPicPr>
                   <pic:blipFill>
-                    <a:blip r:embed="rId30"/>
+                    <a:blip r:embed="rId39"/>
                     <a:stretch>
                       <a:fillRect/>
                     </a:stretch>
@@ -2698,7 +2723,7 @@
                   <pic:spPr bwMode="auto">
                     <a:xfrm>
                       <a:off x="0" y="0"/>
-                      <a:ext cx="5334000" cy="4298842"/>
+                      <a:ext cx="5349240" cy="4311124"/>
                     </a:xfrm>
                     <a:prstGeom prst="rect">
                       <a:avLst/>
@@ -2719,14 +2744,6 @@
     </w:p>
     <w:p>
       <w:pPr>
-        <w:pStyle w:val="ImageCaption"/>
-      </w:pPr>
-      <w:r>
-        <w:t xml:space="preserve">The Publish tab: the five numbered steps, the asset details form, and the log</w:t>
-      </w:r>
-    </w:p>
-    <w:p>
-      <w:pPr>
         <w:pStyle w:val="BodyText"/>
       </w:pPr>
       <w:r>
@@ -2756,7 +2773,7 @@
         <w:t xml:space="preserve"> </w:t>
       </w:r>
       <w:r>
-        <w:t xml:space="preserve">dropdown is the rig you’re building for,</w:t>
+        <w:t xml:space="preserve">dropdown is the rig you're building for,</w:t>
       </w:r>
       <w:r>
         <w:t xml:space="preserve"> </w:t>
@@ -3090,11 +3107,11 @@
         <w:t xml:space="preserve">library, ready for everyone. Publishing needs a remote folder set on the Setup tab.</w:t>
       </w:r>
     </w:p>
-    <w:bookmarkEnd w:id="33"/>
-    <w:bookmarkStart w:id="34" w:name="final-checklist"/>
-    <w:p>
-      <w:pPr>
-        <w:pStyle w:val="Heading3"/>
+    <w:bookmarkEnd w:id="42"/>
+    <w:bookmarkStart w:id="43" w:name="final-checklist"/>
+    <w:p>
+      <w:pPr>
+        <w:pStyle w:val="Heading2"/>
       </w:pPr>
       <w:r>
         <w:t xml:space="preserve">Final checklist</w:t>
@@ -3290,12 +3307,12 @@
         </w:pict>
       </w:r>
     </w:p>
-    <w:bookmarkEnd w:id="34"/>
-    <w:bookmarkEnd w:id="35"/>
-    <w:bookmarkStart w:id="42" w:name="fix-a-garment-you-already-published"/>
-    <w:p>
-      <w:pPr>
-        <w:pStyle w:val="Heading2"/>
+    <w:bookmarkEnd w:id="43"/>
+    <w:bookmarkEnd w:id="44"/>
+    <w:bookmarkStart w:id="51" w:name="X37b8edf204307fb24290c240174af7d3b728a73"/>
+    <w:p>
+      <w:pPr>
+        <w:pStyle w:val="Heading1"/>
       </w:pPr>
       <w:r>
         <w:t xml:space="preserve">6. Fix a garment you already published</w:t>
@@ -3386,7 +3403,10 @@
         <w:t xml:space="preserve"> </w:t>
       </w:r>
       <w:r>
-        <w:t xml:space="preserve">- e.g. </w:t>
+        <w:t xml:space="preserve">- e.g.</w:t>
+      </w:r>
+      <w:r>
+        <w:t xml:space="preserve"> </w:t>
       </w:r>
       <w:r>
         <w:rPr>
@@ -3611,25 +3631,25 @@
     </w:p>
     <w:p>
       <w:pPr>
-        <w:pStyle w:val="CaptionedFigure"/>
+        <w:pStyle w:val="FirstParagraph"/>
       </w:pPr>
       <w:r>
         <w:drawing>
           <wp:inline>
             <wp:extent cx="3495675" cy="857250"/>
             <wp:effectExtent b="0" l="0" r="0" t="0"/>
-            <wp:docPr descr="The overwrite prompt shown when re-publishing under an existing name" title="" id="37" name="Picture"/>
+            <wp:docPr descr="The overwrite prompt shown when re-publishing under an existing name" title="" id="46" name="Picture"/>
             <a:graphic>
               <a:graphicData uri="http://schemas.openxmlformats.org/drawingml/2006/picture">
                 <pic:pic>
                   <pic:nvPicPr>
-                    <pic:cNvPr descr="docs/images/overwrite_prompt.png" id="38" name="Picture"/>
+                    <pic:cNvPr descr="docs/images/overwrite_prompt.png" id="47" name="Picture"/>
                     <pic:cNvPicPr>
                       <a:picLocks noChangeArrowheads="1" noChangeAspect="1"/>
                     </pic:cNvPicPr>
                   </pic:nvPicPr>
                   <pic:blipFill>
-                    <a:blip r:embed="rId36"/>
+                    <a:blip r:embed="rId45"/>
                     <a:stretch>
                       <a:fillRect/>
                     </a:stretch>
@@ -3658,14 +3678,6 @@
     </w:p>
     <w:p>
       <w:pPr>
-        <w:pStyle w:val="ImageCaption"/>
-      </w:pPr>
-      <w:r>
-        <w:t xml:space="preserve">The overwrite prompt shown when re-publishing under an existing name</w:t>
-      </w:r>
-    </w:p>
-    <w:p>
-      <w:pPr>
         <w:pStyle w:val="BodyText"/>
       </w:pPr>
       <w:r>
@@ -3738,7 +3750,7 @@
         <w:t xml:space="preserve"> </w:t>
       </w:r>
       <w:r>
-        <w:t xml:space="preserve">garment into the scene, so those scenes don’t update on their own:</w:t>
+        <w:t xml:space="preserve">garment into the scene, so those scenes don't update on their own:</w:t>
       </w:r>
       <w:r>
         <w:t xml:space="preserve"> </w:t>
@@ -3779,10 +3791,10 @@
         <w:t xml:space="preserve">it again from the library.</w:t>
       </w:r>
     </w:p>
-    <w:bookmarkStart w:id="39" w:name="update-just-the-thumbnails"/>
-    <w:p>
-      <w:pPr>
-        <w:pStyle w:val="Heading3"/>
+    <w:bookmarkStart w:id="48" w:name="update-just-the-thumbnails"/>
+    <w:p>
+      <w:pPr>
+        <w:pStyle w:val="Heading2"/>
       </w:pPr>
       <w:r>
         <w:t xml:space="preserve">Update just the thumbnails</w:t>
@@ -3864,11 +3876,11 @@
         <w:t xml:space="preserve">replaces the current Maya scene, so save your work first.</w:t>
       </w:r>
     </w:p>
-    <w:bookmarkEnd w:id="39"/>
-    <w:bookmarkStart w:id="40" w:name="rename-a-garment"/>
-    <w:p>
-      <w:pPr>
-        <w:pStyle w:val="Heading3"/>
+    <w:bookmarkEnd w:id="48"/>
+    <w:bookmarkStart w:id="49" w:name="rename-a-garment"/>
+    <w:p>
+      <w:pPr>
+        <w:pStyle w:val="Heading2"/>
       </w:pPr>
       <w:r>
         <w:t xml:space="preserve">Rename a garment</w:t>
@@ -4011,7 +4023,7 @@
         </w:numPr>
       </w:pPr>
       <w:r>
-        <w:t xml:space="preserve">Only the name changes. The garment’s nodes (including its</w:t>
+        <w:t xml:space="preserve">Only the name changes. The garment's nodes (including its</w:t>
       </w:r>
       <w:r>
         <w:t xml:space="preserve"> </w:t>
@@ -4032,14 +4044,14 @@
         <w:t xml:space="preserve"> </w:t>
       </w:r>
       <w:r>
-        <w:t xml:space="preserve">untouched, and scenes already wearing it don’t change.</w:t>
-      </w:r>
-    </w:p>
-    <w:bookmarkEnd w:id="40"/>
-    <w:bookmarkStart w:id="41" w:name="delete-a-garment"/>
-    <w:p>
-      <w:pPr>
-        <w:pStyle w:val="Heading3"/>
+        <w:t xml:space="preserve">untouched, and scenes already wearing it don't change.</w:t>
+      </w:r>
+    </w:p>
+    <w:bookmarkEnd w:id="49"/>
+    <w:bookmarkStart w:id="50" w:name="delete-a-garment"/>
+    <w:p>
+      <w:pPr>
+        <w:pStyle w:val="Heading2"/>
       </w:pPr>
       <w:r>
         <w:t xml:space="preserve">Delete a garment</w:t>
@@ -4134,7 +4146,7 @@
         </w:numPr>
       </w:pPr>
       <w:r>
-        <w:t xml:space="preserve">Nothing is destroyed. Each copy is moved to that library’s</w:t>
+        <w:t xml:space="preserve">Nothing is destroyed. Each copy is moved to that library's</w:t>
       </w:r>
       <w:r>
         <w:t xml:space="preserve"> </w:t>
@@ -4167,7 +4179,7 @@
         <w:t xml:space="preserve"> </w:t>
       </w:r>
       <w:r>
-        <w:t xml:space="preserve">copy too) and delete the asset’s marker from the remote’s</w:t>
+        <w:t xml:space="preserve">copy too) and delete the asset's marker from the remote's</w:t>
       </w:r>
       <w:r>
         <w:t xml:space="preserve"> </w:t>
@@ -4194,7 +4206,7 @@
         </w:numPr>
       </w:pPr>
       <w:r>
-        <w:t xml:space="preserve">Scenes already wearing the garment don’t change.</w:t>
+        <w:t xml:space="preserve">Scenes already wearing the garment don't change.</w:t>
       </w:r>
       <w:r>
         <w:t xml:space="preserve"> </w:t>
@@ -4234,12 +4246,12 @@
         </w:pict>
       </w:r>
     </w:p>
-    <w:bookmarkEnd w:id="41"/>
-    <w:bookmarkEnd w:id="42"/>
-    <w:bookmarkStart w:id="43" w:name="genie-export"/>
-    <w:p>
-      <w:pPr>
-        <w:pStyle w:val="Heading2"/>
+    <w:bookmarkEnd w:id="50"/>
+    <w:bookmarkEnd w:id="51"/>
+    <w:bookmarkStart w:id="52" w:name="X21e6e2f1b00f7c4b10a258c0f73e4ad544d9f5d"/>
+    <w:p>
+      <w:pPr>
+        <w:pStyle w:val="Heading1"/>
       </w:pPr>
       <w:r>
         <w:t xml:space="preserve">7. Genie export</w:t>
@@ -4333,78 +4345,78 @@
         </w:pict>
       </w:r>
     </w:p>
-    <w:bookmarkEnd w:id="43"/>
-    <w:bookmarkStart w:id="47" w:name="validation-error-reference"/>
+    <w:bookmarkEnd w:id="52"/>
+    <w:bookmarkStart w:id="56" w:name="Xeab5ddf6491a4b8e55c9b610c4924b7ef9a5e50"/>
+    <w:p>
+      <w:pPr>
+        <w:pStyle w:val="Heading1"/>
+      </w:pPr>
+      <w:r>
+        <w:t xml:space="preserve">8. Validation error reference</w:t>
+      </w:r>
+    </w:p>
+    <w:p>
+      <w:pPr>
+        <w:pStyle w:val="FirstParagraph"/>
+      </w:pPr>
+      <w:r>
+        <w:t xml:space="preserve">Outfitter validates in three stages. Any</w:t>
+      </w:r>
+      <w:r>
+        <w:t xml:space="preserve"> </w:t>
+      </w:r>
+      <w:r>
+        <w:rPr>
+          <w:b/>
+          <w:bCs/>
+        </w:rPr>
+        <w:t xml:space="preserve">error</w:t>
+      </w:r>
+      <w:r>
+        <w:t xml:space="preserve"> </w:t>
+      </w:r>
+      <w:r>
+        <w:t xml:space="preserve">is a hard stop and leaves the scene</w:t>
+      </w:r>
+      <w:r>
+        <w:t xml:space="preserve"> </w:t>
+      </w:r>
+      <w:r>
+        <w:t xml:space="preserve">unchanged;</w:t>
+      </w:r>
+      <w:r>
+        <w:t xml:space="preserve"> </w:t>
+      </w:r>
+      <w:r>
+        <w:rPr>
+          <w:b/>
+          <w:bCs/>
+        </w:rPr>
+        <w:t xml:space="preserve">warnings</w:t>
+      </w:r>
+      <w:r>
+        <w:t xml:space="preserve"> </w:t>
+      </w:r>
+      <w:r>
+        <w:t xml:space="preserve">are advisory. Each message names the node at fault and how to fix</w:t>
+      </w:r>
+      <w:r>
+        <w:t xml:space="preserve"> </w:t>
+      </w:r>
+      <w:r>
+        <w:t xml:space="preserve">it. If attach fails for any reason, the scene is rolled back - you never end up with a</w:t>
+      </w:r>
+      <w:r>
+        <w:t xml:space="preserve"> </w:t>
+      </w:r>
+      <w:r>
+        <w:t xml:space="preserve">half-attached garment.</w:t>
+      </w:r>
+    </w:p>
+    <w:bookmarkStart w:id="53" w:name="X626a359cc9bebd870693e1ccc2c3646b6d5e961"/>
     <w:p>
       <w:pPr>
         <w:pStyle w:val="Heading2"/>
-      </w:pPr>
-      <w:r>
-        <w:t xml:space="preserve">8. Validation error reference</w:t>
-      </w:r>
-    </w:p>
-    <w:p>
-      <w:pPr>
-        <w:pStyle w:val="FirstParagraph"/>
-      </w:pPr>
-      <w:r>
-        <w:t xml:space="preserve">Outfitter validates in three stages. Any</w:t>
-      </w:r>
-      <w:r>
-        <w:t xml:space="preserve"> </w:t>
-      </w:r>
-      <w:r>
-        <w:rPr>
-          <w:b/>
-          <w:bCs/>
-        </w:rPr>
-        <w:t xml:space="preserve">error</w:t>
-      </w:r>
-      <w:r>
-        <w:t xml:space="preserve"> </w:t>
-      </w:r>
-      <w:r>
-        <w:t xml:space="preserve">is a hard stop and leaves the scene</w:t>
-      </w:r>
-      <w:r>
-        <w:t xml:space="preserve"> </w:t>
-      </w:r>
-      <w:r>
-        <w:t xml:space="preserve">unchanged;</w:t>
-      </w:r>
-      <w:r>
-        <w:t xml:space="preserve"> </w:t>
-      </w:r>
-      <w:r>
-        <w:rPr>
-          <w:b/>
-          <w:bCs/>
-        </w:rPr>
-        <w:t xml:space="preserve">warnings</w:t>
-      </w:r>
-      <w:r>
-        <w:t xml:space="preserve"> </w:t>
-      </w:r>
-      <w:r>
-        <w:t xml:space="preserve">are advisory. Each message names the node at fault and how to fix</w:t>
-      </w:r>
-      <w:r>
-        <w:t xml:space="preserve"> </w:t>
-      </w:r>
-      <w:r>
-        <w:t xml:space="preserve">it. If attach fails for any reason, the scene is rolled back - you never end up with a</w:t>
-      </w:r>
-      <w:r>
-        <w:t xml:space="preserve"> </w:t>
-      </w:r>
-      <w:r>
-        <w:t xml:space="preserve">half-attached garment.</w:t>
-      </w:r>
-    </w:p>
-    <w:bookmarkStart w:id="44" w:name="X626a359cc9bebd870693e1ccc2c3646b6d5e961"/>
-    <w:p>
-      <w:pPr>
-        <w:pStyle w:val="Heading3"/>
       </w:pPr>
       <w:r>
         <w:t xml:space="preserve">Stage A - the asset file (before anything touches the scene)</w:t>
@@ -4413,9 +4425,23 @@
     <w:tbl>
       <w:tblPr>
         <w:tblStyle w:val="Table"/>
-        <w:tblW w:type="pct" w:w="5000"/>
-        <w:tblLayout w:type="fixed"/>
+        <w:tblW w:type="auto" w:w="0"/>
+        <w:jc w:val="center"/>
         <w:tblLook w:firstRow="1" w:lastRow="0" w:firstColumn="0" w:lastColumn="0" w:noHBand="0" w:noVBand="0" w:val="0020"/>
+        <w:tblBorders>
+          <w:top w:val="single" w:sz="4" w:space="0" w:color="BFBFBF"/>
+          <w:bottom w:val="single" w:sz="4" w:space="0" w:color="BFBFBF"/>
+          <w:insideH w:val="single" w:sz="4" w:space="0" w:color="BFBFBF"/>
+          <w:left w:val="single" w:sz="4" w:space="0" w:color="BFBFBF"/>
+          <w:right w:val="single" w:sz="4" w:space="0" w:color="BFBFBF"/>
+          <w:insideV w:val="single" w:sz="4" w:space="0" w:color="BFBFBF"/>
+        </w:tblBorders>
+        <w:tblCellMar>
+          <w:top w:w="50" w:type="dxa"/>
+          <w:bottom w:w="50" w:type="dxa"/>
+          <w:left w:w="100" w:type="dxa"/>
+          <w:right w:w="100" w:type="dxa"/>
+        </w:tblCellMar>
       </w:tblPr>
       <w:tblGrid>
         <w:gridCol w:w="2640"/>
@@ -4425,36 +4451,61 @@
       <w:tr>
         <w:trPr>
           <w:tblHeader w:val="on"/>
+          <w:tblHeader/>
         </w:trPr>
         <w:tc>
-          <w:tcPr/>
-          <w:p>
-            <w:pPr>
-              <w:pStyle w:val="Compact"/>
-            </w:pPr>
-            <w:r>
+          <w:tcPr>
+            <w:shd w:val="clear" w:color="auto" w:fill="EAF1F8"/>
+          </w:tcPr>
+          <w:p>
+            <w:pPr>
+              <w:pStyle w:val="Compact"/>
+              <w:spacing w:after="0" w:line="252" w:lineRule="auto"/>
+            </w:pPr>
+            <w:r>
+              <w:rPr>
+                <w:b/>
+                <w:color w:val="1F4E79"/>
+                <w:sz w:val="19"/>
+              </w:rPr>
               <w:t xml:space="preserve">Code</w:t>
             </w:r>
           </w:p>
         </w:tc>
         <w:tc>
-          <w:tcPr/>
-          <w:p>
-            <w:pPr>
-              <w:pStyle w:val="Compact"/>
-            </w:pPr>
-            <w:r>
+          <w:tcPr>
+            <w:shd w:val="clear" w:color="auto" w:fill="EAF1F8"/>
+          </w:tcPr>
+          <w:p>
+            <w:pPr>
+              <w:pStyle w:val="Compact"/>
+              <w:spacing w:after="0" w:line="252" w:lineRule="auto"/>
+            </w:pPr>
+            <w:r>
+              <w:rPr>
+                <w:b/>
+                <w:color w:val="1F4E79"/>
+                <w:sz w:val="19"/>
+              </w:rPr>
               <w:t xml:space="preserve">Meaning</w:t>
             </w:r>
           </w:p>
         </w:tc>
         <w:tc>
-          <w:tcPr/>
-          <w:p>
-            <w:pPr>
-              <w:pStyle w:val="Compact"/>
-            </w:pPr>
-            <w:r>
+          <w:tcPr>
+            <w:shd w:val="clear" w:color="auto" w:fill="EAF1F8"/>
+          </w:tcPr>
+          <w:p>
+            <w:pPr>
+              <w:pStyle w:val="Compact"/>
+              <w:spacing w:after="0" w:line="252" w:lineRule="auto"/>
+            </w:pPr>
+            <w:r>
+              <w:rPr>
+                <w:b/>
+                <w:color w:val="1F4E79"/>
+                <w:sz w:val="19"/>
+              </w:rPr>
               <w:t xml:space="preserve">Fix</w:t>
             </w:r>
           </w:p>
@@ -4466,10 +4517,12 @@
           <w:p>
             <w:pPr>
               <w:pStyle w:val="Compact"/>
+              <w:spacing w:after="0" w:line="252" w:lineRule="auto"/>
             </w:pPr>
             <w:r>
               <w:rPr>
                 <w:rStyle w:val="VerbatimChar"/>
+                <w:sz w:val="19"/>
               </w:rPr>
               <w:t xml:space="preserve">no_metadata</w:t>
             </w:r>
@@ -4480,44 +4533,75 @@
           <w:p>
             <w:pPr>
               <w:pStyle w:val="Compact"/>
-            </w:pPr>
-            <w:r>
+              <w:spacing w:after="0" w:line="252" w:lineRule="auto"/>
+            </w:pPr>
+            <w:r>
+              <w:rPr>
+                <w:sz w:val="19"/>
+              </w:rPr>
               <w:t xml:space="preserve">No readable</w:t>
             </w:r>
             <w:r>
+              <w:rPr>
+                <w:sz w:val="19"/>
+              </w:rPr>
               <w:t xml:space="preserve"> </w:t>
             </w:r>
             <w:r>
               <w:rPr>
                 <w:rStyle w:val="VerbatimChar"/>
+                <w:sz w:val="19"/>
               </w:rPr>
               <w:t xml:space="preserve">cloth_info</w:t>
             </w:r>
             <w:r>
+              <w:rPr>
+                <w:sz w:val="19"/>
+              </w:rPr>
               <w:t xml:space="preserve"> </w:t>
             </w:r>
             <w:r>
+              <w:rPr>
+                <w:sz w:val="19"/>
+              </w:rPr>
               <w:t xml:space="preserve">or sidecar</w:t>
             </w:r>
             <w:r>
+              <w:rPr>
+                <w:sz w:val="19"/>
+              </w:rPr>
               <w:t xml:space="preserve"> </w:t>
             </w:r>
             <w:r>
               <w:rPr>
                 <w:rStyle w:val="VerbatimChar"/>
+                <w:sz w:val="19"/>
               </w:rPr>
               <w:t xml:space="preserve">.json</w:t>
             </w:r>
             <w:r>
-              <w:t xml:space="preserve">, or a required field (incl. </w:t>
+              <w:rPr>
+                <w:sz w:val="19"/>
+              </w:rPr>
+              <w:t xml:space="preserve">, or a required field (incl.</w:t>
+            </w:r>
+            <w:r>
+              <w:rPr>
+                <w:sz w:val="19"/>
+              </w:rPr>
+              <w:t xml:space="preserve"> </w:t>
             </w:r>
             <w:r>
               <w:rPr>
                 <w:rStyle w:val="VerbatimChar"/>
+                <w:sz w:val="19"/>
               </w:rPr>
               <w:t xml:space="preserve">gender</w:t>
             </w:r>
             <w:r>
+              <w:rPr>
+                <w:sz w:val="19"/>
+              </w:rPr>
               <w:t xml:space="preserve">) is missing or invalid.</w:t>
             </w:r>
           </w:p>
@@ -4527,8 +4611,12 @@
           <w:p>
             <w:pPr>
               <w:pStyle w:val="Compact"/>
-            </w:pPr>
-            <w:r>
+              <w:spacing w:after="0" w:line="252" w:lineRule="auto"/>
+            </w:pPr>
+            <w:r>
+              <w:rPr>
+                <w:sz w:val="19"/>
+              </w:rPr>
               <w:t xml:space="preserve">Re-publish with all details filled in.</w:t>
             </w:r>
           </w:p>
@@ -4540,10 +4628,12 @@
           <w:p>
             <w:pPr>
               <w:pStyle w:val="Compact"/>
+              <w:spacing w:after="0" w:line="252" w:lineRule="auto"/>
             </w:pPr>
             <w:r>
               <w:rPr>
                 <w:rStyle w:val="VerbatimChar"/>
+                <w:sz w:val="19"/>
               </w:rPr>
               <w:t xml:space="preserve">no_info_node</w:t>
             </w:r>
@@ -4554,23 +4644,37 @@
           <w:p>
             <w:pPr>
               <w:pStyle w:val="Compact"/>
-            </w:pPr>
-            <w:r>
+              <w:spacing w:after="0" w:line="252" w:lineRule="auto"/>
+            </w:pPr>
+            <w:r>
+              <w:rPr>
+                <w:sz w:val="19"/>
+              </w:rPr>
               <w:t xml:space="preserve">The</w:t>
             </w:r>
             <w:r>
+              <w:rPr>
+                <w:sz w:val="19"/>
+              </w:rPr>
               <w:t xml:space="preserve"> </w:t>
             </w:r>
             <w:r>
               <w:rPr>
                 <w:rStyle w:val="VerbatimChar"/>
+                <w:sz w:val="19"/>
               </w:rPr>
               <w:t xml:space="preserve">cloth_info</w:t>
             </w:r>
             <w:r>
+              <w:rPr>
+                <w:sz w:val="19"/>
+              </w:rPr>
               <w:t xml:space="preserve"> </w:t>
             </w:r>
             <w:r>
+              <w:rPr>
+                <w:sz w:val="19"/>
+              </w:rPr>
               <w:t xml:space="preserve">node is missing.</w:t>
             </w:r>
           </w:p>
@@ -4580,8 +4684,12 @@
           <w:p>
             <w:pPr>
               <w:pStyle w:val="Compact"/>
-            </w:pPr>
-            <w:r>
+              <w:spacing w:after="0" w:line="252" w:lineRule="auto"/>
+            </w:pPr>
+            <w:r>
+              <w:rPr>
+                <w:sz w:val="19"/>
+              </w:rPr>
               <w:t xml:space="preserve">Re-publish from the Publish tab, which adds it.</w:t>
             </w:r>
           </w:p>
@@ -4593,10 +4701,12 @@
           <w:p>
             <w:pPr>
               <w:pStyle w:val="Compact"/>
+              <w:spacing w:after="0" w:line="252" w:lineRule="auto"/>
             </w:pPr>
             <w:r>
               <w:rPr>
                 <w:rStyle w:val="VerbatimChar"/>
+                <w:sz w:val="19"/>
               </w:rPr>
               <w:t xml:space="preserve">missing_group</w:t>
             </w:r>
@@ -4607,44 +4717,69 @@
           <w:p>
             <w:pPr>
               <w:pStyle w:val="Compact"/>
+              <w:spacing w:after="0" w:line="252" w:lineRule="auto"/>
             </w:pPr>
             <w:r>
               <w:rPr>
                 <w:rStyle w:val="VerbatimChar"/>
+                <w:sz w:val="19"/>
               </w:rPr>
               <w:t xml:space="preserve">Mesh_GRP</w:t>
             </w:r>
             <w:r>
+              <w:rPr>
+                <w:sz w:val="19"/>
+              </w:rPr>
               <w:t xml:space="preserve">,</w:t>
             </w:r>
             <w:r>
+              <w:rPr>
+                <w:sz w:val="19"/>
+              </w:rPr>
               <w:t xml:space="preserve"> </w:t>
             </w:r>
             <w:r>
               <w:rPr>
                 <w:rStyle w:val="VerbatimChar"/>
+                <w:sz w:val="19"/>
               </w:rPr>
               <w:t xml:space="preserve">Rig_GRP</w:t>
             </w:r>
             <w:r>
+              <w:rPr>
+                <w:sz w:val="19"/>
+              </w:rPr>
               <w:t xml:space="preserve"> </w:t>
             </w:r>
             <w:r>
+              <w:rPr>
+                <w:sz w:val="19"/>
+              </w:rPr>
               <w:t xml:space="preserve">or</w:t>
             </w:r>
             <w:r>
+              <w:rPr>
+                <w:sz w:val="19"/>
+              </w:rPr>
               <w:t xml:space="preserve"> </w:t>
             </w:r>
             <w:r>
               <w:rPr>
                 <w:rStyle w:val="VerbatimChar"/>
+                <w:sz w:val="19"/>
               </w:rPr>
               <w:t xml:space="preserve">Ctrl_GRP</w:t>
             </w:r>
             <w:r>
+              <w:rPr>
+                <w:sz w:val="19"/>
+              </w:rPr>
               <w:t xml:space="preserve"> </w:t>
             </w:r>
             <w:r>
+              <w:rPr>
+                <w:sz w:val="19"/>
+              </w:rPr>
               <w:t xml:space="preserve">is missing.</w:t>
             </w:r>
           </w:p>
@@ -4654,9 +4789,13 @@
           <w:p>
             <w:pPr>
               <w:pStyle w:val="Compact"/>
-            </w:pPr>
-            <w:r>
-              <w:t xml:space="preserve">Create the missing group under the asset’s top group.</w:t>
+              <w:spacing w:after="0" w:line="252" w:lineRule="auto"/>
+            </w:pPr>
+            <w:r>
+              <w:rPr>
+                <w:sz w:val="19"/>
+              </w:rPr>
+              <w:t xml:space="preserve">Create the missing group under the asset's top group.</w:t>
             </w:r>
           </w:p>
         </w:tc>
@@ -4667,10 +4806,12 @@
           <w:p>
             <w:pPr>
               <w:pStyle w:val="Compact"/>
+              <w:spacing w:after="0" w:line="252" w:lineRule="auto"/>
             </w:pPr>
             <w:r>
               <w:rPr>
                 <w:rStyle w:val="VerbatimChar"/>
+                <w:sz w:val="19"/>
               </w:rPr>
               <w:t xml:space="preserve">no_root_joint</w:t>
             </w:r>
@@ -4681,23 +4822,37 @@
           <w:p>
             <w:pPr>
               <w:pStyle w:val="Compact"/>
-            </w:pPr>
-            <w:r>
+              <w:spacing w:after="0" w:line="252" w:lineRule="auto"/>
+            </w:pPr>
+            <w:r>
+              <w:rPr>
+                <w:sz w:val="19"/>
+              </w:rPr>
               <w:t xml:space="preserve">No</w:t>
             </w:r>
             <w:r>
+              <w:rPr>
+                <w:sz w:val="19"/>
+              </w:rPr>
               <w:t xml:space="preserve"> </w:t>
             </w:r>
             <w:r>
               <w:rPr>
                 <w:rStyle w:val="VerbatimChar"/>
+                <w:sz w:val="19"/>
               </w:rPr>
               <w:t xml:space="preserve">cloth_root</w:t>
             </w:r>
             <w:r>
+              <w:rPr>
+                <w:sz w:val="19"/>
+              </w:rPr>
               <w:t xml:space="preserve"> </w:t>
             </w:r>
             <w:r>
+              <w:rPr>
+                <w:sz w:val="19"/>
+              </w:rPr>
               <w:t xml:space="preserve">joint.</w:t>
             </w:r>
           </w:p>
@@ -4707,21 +4862,32 @@
           <w:p>
             <w:pPr>
               <w:pStyle w:val="Compact"/>
-            </w:pPr>
-            <w:r>
+              <w:spacing w:after="0" w:line="252" w:lineRule="auto"/>
+            </w:pPr>
+            <w:r>
+              <w:rPr>
+                <w:sz w:val="19"/>
+              </w:rPr>
               <w:t xml:space="preserve">Rebuild with</w:t>
             </w:r>
             <w:r>
+              <w:rPr>
+                <w:sz w:val="19"/>
+              </w:rPr>
               <w:t xml:space="preserve"> </w:t>
             </w:r>
             <w:r>
               <w:rPr>
                 <w:b/>
                 <w:bCs/>
+                <w:sz w:val="19"/>
               </w:rPr>
               <w:t xml:space="preserve">Create cloth skeleton</w:t>
             </w:r>
             <w:r>
+              <w:rPr>
+                <w:sz w:val="19"/>
+              </w:rPr>
               <w:t xml:space="preserve">.</w:t>
             </w:r>
           </w:p>
@@ -4733,10 +4899,12 @@
           <w:p>
             <w:pPr>
               <w:pStyle w:val="Compact"/>
+              <w:spacing w:after="0" w:line="252" w:lineRule="auto"/>
             </w:pPr>
             <w:r>
               <w:rPr>
                 <w:rStyle w:val="VerbatimChar"/>
+                <w:sz w:val="19"/>
               </w:rPr>
               <w:t xml:space="preserve">no_cloth_joints</w:t>
             </w:r>
@@ -4747,23 +4915,37 @@
           <w:p>
             <w:pPr>
               <w:pStyle w:val="Compact"/>
-            </w:pPr>
-            <w:r>
+              <w:spacing w:after="0" w:line="252" w:lineRule="auto"/>
+            </w:pPr>
+            <w:r>
+              <w:rPr>
+                <w:sz w:val="19"/>
+              </w:rPr>
               <w:t xml:space="preserve">No</w:t>
             </w:r>
             <w:r>
+              <w:rPr>
+                <w:sz w:val="19"/>
+              </w:rPr>
               <w:t xml:space="preserve"> </w:t>
             </w:r>
             <w:r>
               <w:rPr>
                 <w:rStyle w:val="VerbatimChar"/>
+                <w:sz w:val="19"/>
               </w:rPr>
               <w:t xml:space="preserve">cloth_</w:t>
             </w:r>
             <w:r>
+              <w:rPr>
+                <w:sz w:val="19"/>
+              </w:rPr>
               <w:t xml:space="preserve"> </w:t>
             </w:r>
             <w:r>
+              <w:rPr>
+                <w:sz w:val="19"/>
+              </w:rPr>
               <w:t xml:space="preserve">joints found.</w:t>
             </w:r>
           </w:p>
@@ -4773,21 +4955,32 @@
           <w:p>
             <w:pPr>
               <w:pStyle w:val="Compact"/>
-            </w:pPr>
-            <w:r>
+              <w:spacing w:after="0" w:line="252" w:lineRule="auto"/>
+            </w:pPr>
+            <w:r>
+              <w:rPr>
+                <w:sz w:val="19"/>
+              </w:rPr>
               <w:t xml:space="preserve">Rebuild with</w:t>
             </w:r>
             <w:r>
+              <w:rPr>
+                <w:sz w:val="19"/>
+              </w:rPr>
               <w:t xml:space="preserve"> </w:t>
             </w:r>
             <w:r>
               <w:rPr>
                 <w:b/>
                 <w:bCs/>
+                <w:sz w:val="19"/>
               </w:rPr>
               <w:t xml:space="preserve">Create cloth skeleton</w:t>
             </w:r>
             <w:r>
+              <w:rPr>
+                <w:sz w:val="19"/>
+              </w:rPr>
               <w:t xml:space="preserve">.</w:t>
             </w:r>
           </w:p>
@@ -4799,10 +4992,12 @@
           <w:p>
             <w:pPr>
               <w:pStyle w:val="Compact"/>
+              <w:spacing w:after="0" w:line="252" w:lineRule="auto"/>
             </w:pPr>
             <w:r>
               <w:rPr>
                 <w:rStyle w:val="VerbatimChar"/>
+                <w:sz w:val="19"/>
               </w:rPr>
               <w:t xml:space="preserve">bad_joint_suffix</w:t>
             </w:r>
@@ -4813,23 +5008,37 @@
           <w:p>
             <w:pPr>
               <w:pStyle w:val="Compact"/>
-            </w:pPr>
-            <w:r>
+              <w:spacing w:after="0" w:line="252" w:lineRule="auto"/>
+            </w:pPr>
+            <w:r>
+              <w:rPr>
+                <w:sz w:val="19"/>
+              </w:rPr>
               <w:t xml:space="preserve">A connection joint has a</w:t>
             </w:r>
             <w:r>
+              <w:rPr>
+                <w:sz w:val="19"/>
+              </w:rPr>
               <w:t xml:space="preserve"> </w:t>
             </w:r>
             <w:r>
               <w:rPr>
                 <w:rStyle w:val="VerbatimChar"/>
+                <w:sz w:val="19"/>
               </w:rPr>
               <w:t xml:space="preserve">_jnt</w:t>
             </w:r>
             <w:r>
+              <w:rPr>
+                <w:sz w:val="19"/>
+              </w:rPr>
               <w:t xml:space="preserve"> </w:t>
             </w:r>
             <w:r>
+              <w:rPr>
+                <w:sz w:val="19"/>
+              </w:rPr>
               <w:t xml:space="preserve">suffix.</w:t>
             </w:r>
           </w:p>
@@ -4839,35 +5048,56 @@
           <w:p>
             <w:pPr>
               <w:pStyle w:val="Compact"/>
-            </w:pPr>
-            <w:r>
+              <w:spacing w:after="0" w:line="252" w:lineRule="auto"/>
+            </w:pPr>
+            <w:r>
+              <w:rPr>
+                <w:sz w:val="19"/>
+              </w:rPr>
               <w:t xml:space="preserve">Name =</w:t>
             </w:r>
             <w:r>
+              <w:rPr>
+                <w:sz w:val="19"/>
+              </w:rPr>
               <w:t xml:space="preserve"> </w:t>
             </w:r>
             <w:r>
               <w:rPr>
                 <w:rStyle w:val="VerbatimChar"/>
+                <w:sz w:val="19"/>
               </w:rPr>
               <w:t xml:space="preserve">cloth_</w:t>
             </w:r>
             <w:r>
+              <w:rPr>
+                <w:sz w:val="19"/>
+              </w:rPr>
               <w:t xml:space="preserve"> </w:t>
             </w:r>
             <w:r>
+              <w:rPr>
+                <w:sz w:val="19"/>
+              </w:rPr>
               <w:t xml:space="preserve">+ the exact body joint name, no</w:t>
             </w:r>
             <w:r>
+              <w:rPr>
+                <w:sz w:val="19"/>
+              </w:rPr>
               <w:t xml:space="preserve"> </w:t>
             </w:r>
             <w:r>
               <w:rPr>
                 <w:rStyle w:val="VerbatimChar"/>
+                <w:sz w:val="19"/>
               </w:rPr>
               <w:t xml:space="preserve">_jnt</w:t>
             </w:r>
             <w:r>
+              <w:rPr>
+                <w:sz w:val="19"/>
+              </w:rPr>
               <w:t xml:space="preserve">.</w:t>
             </w:r>
           </w:p>
@@ -4879,10 +5109,12 @@
           <w:p>
             <w:pPr>
               <w:pStyle w:val="Compact"/>
+              <w:spacing w:after="0" w:line="252" w:lineRule="auto"/>
             </w:pPr>
             <w:r>
               <w:rPr>
                 <w:rStyle w:val="VerbatimChar"/>
+                <w:sz w:val="19"/>
               </w:rPr>
               <w:t xml:space="preserve">has_references</w:t>
             </w:r>
@@ -4893,8 +5125,12 @@
           <w:p>
             <w:pPr>
               <w:pStyle w:val="Compact"/>
-            </w:pPr>
-            <w:r>
+              <w:spacing w:after="0" w:line="252" w:lineRule="auto"/>
+            </w:pPr>
+            <w:r>
+              <w:rPr>
+                <w:sz w:val="19"/>
+              </w:rPr>
               <w:t xml:space="preserve">The asset contains references.</w:t>
             </w:r>
           </w:p>
@@ -4904,8 +5140,12 @@
           <w:p>
             <w:pPr>
               <w:pStyle w:val="Compact"/>
-            </w:pPr>
-            <w:r>
+              <w:spacing w:after="0" w:line="252" w:lineRule="auto"/>
+            </w:pPr>
+            <w:r>
+              <w:rPr>
+                <w:sz w:val="19"/>
+              </w:rPr>
               <w:t xml:space="preserve">Import or remove all references.</w:t>
             </w:r>
           </w:p>
@@ -4917,10 +5157,12 @@
           <w:p>
             <w:pPr>
               <w:pStyle w:val="Compact"/>
+              <w:spacing w:after="0" w:line="252" w:lineRule="auto"/>
             </w:pPr>
             <w:r>
               <w:rPr>
                 <w:rStyle w:val="VerbatimChar"/>
+                <w:sz w:val="19"/>
               </w:rPr>
               <w:t xml:space="preserve">has_namespaces</w:t>
             </w:r>
@@ -4931,8 +5173,12 @@
           <w:p>
             <w:pPr>
               <w:pStyle w:val="Compact"/>
-            </w:pPr>
-            <w:r>
+              <w:spacing w:after="0" w:line="252" w:lineRule="auto"/>
+            </w:pPr>
+            <w:r>
+              <w:rPr>
+                <w:sz w:val="19"/>
+              </w:rPr>
               <w:t xml:space="preserve">The asset contains namespaces.</w:t>
             </w:r>
           </w:p>
@@ -4942,8 +5188,12 @@
           <w:p>
             <w:pPr>
               <w:pStyle w:val="Compact"/>
-            </w:pPr>
-            <w:r>
+              <w:spacing w:after="0" w:line="252" w:lineRule="auto"/>
+            </w:pPr>
+            <w:r>
+              <w:rPr>
+                <w:sz w:val="19"/>
+              </w:rPr>
               <w:t xml:space="preserve">Remove them; Outfitter adds one at attach.</w:t>
             </w:r>
           </w:p>
@@ -4955,10 +5205,12 @@
           <w:p>
             <w:pPr>
               <w:pStyle w:val="Compact"/>
+              <w:spacing w:after="0" w:line="252" w:lineRule="auto"/>
             </w:pPr>
             <w:r>
               <w:rPr>
                 <w:rStyle w:val="VerbatimChar"/>
+                <w:sz w:val="19"/>
               </w:rPr>
               <w:t xml:space="preserve">forbidden_node_type</w:t>
             </w:r>
@@ -4969,50 +5221,81 @@
           <w:p>
             <w:pPr>
               <w:pStyle w:val="Compact"/>
-            </w:pPr>
-            <w:r>
+              <w:spacing w:after="0" w:line="252" w:lineRule="auto"/>
+            </w:pPr>
+            <w:r>
+              <w:rPr>
+                <w:sz w:val="19"/>
+              </w:rPr>
               <w:t xml:space="preserve">A</w:t>
             </w:r>
             <w:r>
+              <w:rPr>
+                <w:sz w:val="19"/>
+              </w:rPr>
               <w:t xml:space="preserve"> </w:t>
             </w:r>
             <w:r>
               <w:rPr>
                 <w:rStyle w:val="VerbatimChar"/>
+                <w:sz w:val="19"/>
               </w:rPr>
               <w:t xml:space="preserve">blendShape</w:t>
             </w:r>
             <w:r>
+              <w:rPr>
+                <w:sz w:val="19"/>
+              </w:rPr>
               <w:t xml:space="preserve">,</w:t>
             </w:r>
             <w:r>
+              <w:rPr>
+                <w:sz w:val="19"/>
+              </w:rPr>
               <w:t xml:space="preserve"> </w:t>
             </w:r>
             <w:r>
               <w:rPr>
                 <w:rStyle w:val="VerbatimChar"/>
+                <w:sz w:val="19"/>
               </w:rPr>
               <w:t xml:space="preserve">nCloth</w:t>
             </w:r>
             <w:r>
+              <w:rPr>
+                <w:sz w:val="19"/>
+              </w:rPr>
               <w:t xml:space="preserve"> </w:t>
             </w:r>
             <w:r>
+              <w:rPr>
+                <w:sz w:val="19"/>
+              </w:rPr>
               <w:t xml:space="preserve">or</w:t>
             </w:r>
             <w:r>
+              <w:rPr>
+                <w:sz w:val="19"/>
+              </w:rPr>
               <w:t xml:space="preserve"> </w:t>
             </w:r>
             <w:r>
               <w:rPr>
                 <w:rStyle w:val="VerbatimChar"/>
+                <w:sz w:val="19"/>
               </w:rPr>
               <w:t xml:space="preserve">nucleus</w:t>
             </w:r>
             <w:r>
+              <w:rPr>
+                <w:sz w:val="19"/>
+              </w:rPr>
               <w:t xml:space="preserve"> </w:t>
             </w:r>
             <w:r>
+              <w:rPr>
+                <w:sz w:val="19"/>
+              </w:rPr>
               <w:t xml:space="preserve">node is present.</w:t>
             </w:r>
           </w:p>
@@ -5022,9 +5305,13 @@
           <w:p>
             <w:pPr>
               <w:pStyle w:val="Compact"/>
-            </w:pPr>
-            <w:r>
-              <w:t xml:space="preserve">Remove it; blendShapes and simulation aren’t supported.</w:t>
+              <w:spacing w:after="0" w:line="252" w:lineRule="auto"/>
+            </w:pPr>
+            <w:r>
+              <w:rPr>
+                <w:sz w:val="19"/>
+              </w:rPr>
+              <w:t xml:space="preserve">Remove it; blendShapes and simulation aren't supported.</w:t>
             </w:r>
           </w:p>
         </w:tc>
@@ -5035,10 +5322,12 @@
           <w:p>
             <w:pPr>
               <w:pStyle w:val="Compact"/>
+              <w:spacing w:after="0" w:line="252" w:lineRule="auto"/>
             </w:pPr>
             <w:r>
               <w:rPr>
                 <w:rStyle w:val="VerbatimChar"/>
+                <w:sz w:val="19"/>
               </w:rPr>
               <w:t xml:space="preserve">duplicate_name</w:t>
             </w:r>
@@ -5049,8 +5338,12 @@
           <w:p>
             <w:pPr>
               <w:pStyle w:val="Compact"/>
-            </w:pPr>
-            <w:r>
+              <w:spacing w:after="0" w:line="252" w:lineRule="auto"/>
+            </w:pPr>
+            <w:r>
+              <w:rPr>
+                <w:sz w:val="19"/>
+              </w:rPr>
               <w:t xml:space="preserve">A node name appears more than once.</w:t>
             </w:r>
           </w:p>
@@ -5060,19 +5353,23 @@
           <w:p>
             <w:pPr>
               <w:pStyle w:val="Compact"/>
-            </w:pPr>
-            <w:r>
+              <w:spacing w:after="0" w:line="252" w:lineRule="auto"/>
+            </w:pPr>
+            <w:r>
+              <w:rPr>
+                <w:sz w:val="19"/>
+              </w:rPr>
               <w:t xml:space="preserve">Make every node name unique.</w:t>
             </w:r>
           </w:p>
         </w:tc>
       </w:tr>
     </w:tbl>
-    <w:bookmarkEnd w:id="44"/>
-    <w:bookmarkStart w:id="45" w:name="stage-b---the-scene-just-before-import"/>
-    <w:p>
-      <w:pPr>
-        <w:pStyle w:val="Heading3"/>
+    <w:bookmarkEnd w:id="53"/>
+    <w:bookmarkStart w:id="54" w:name="stage-b---the-scene-just-before-import"/>
+    <w:p>
+      <w:pPr>
+        <w:pStyle w:val="Heading2"/>
       </w:pPr>
       <w:r>
         <w:t xml:space="preserve">Stage B - the scene, just before import</w:t>
@@ -5081,9 +5378,23 @@
     <w:tbl>
       <w:tblPr>
         <w:tblStyle w:val="Table"/>
-        <w:tblW w:type="pct" w:w="5000"/>
-        <w:tblLayout w:type="fixed"/>
+        <w:tblW w:type="auto" w:w="0"/>
+        <w:jc w:val="center"/>
         <w:tblLook w:firstRow="1" w:lastRow="0" w:firstColumn="0" w:lastColumn="0" w:noHBand="0" w:noVBand="0" w:val="0020"/>
+        <w:tblBorders>
+          <w:top w:val="single" w:sz="4" w:space="0" w:color="BFBFBF"/>
+          <w:bottom w:val="single" w:sz="4" w:space="0" w:color="BFBFBF"/>
+          <w:insideH w:val="single" w:sz="4" w:space="0" w:color="BFBFBF"/>
+          <w:left w:val="single" w:sz="4" w:space="0" w:color="BFBFBF"/>
+          <w:right w:val="single" w:sz="4" w:space="0" w:color="BFBFBF"/>
+          <w:insideV w:val="single" w:sz="4" w:space="0" w:color="BFBFBF"/>
+        </w:tblBorders>
+        <w:tblCellMar>
+          <w:top w:w="50" w:type="dxa"/>
+          <w:bottom w:w="50" w:type="dxa"/>
+          <w:left w:w="100" w:type="dxa"/>
+          <w:right w:w="100" w:type="dxa"/>
+        </w:tblCellMar>
       </w:tblPr>
       <w:tblGrid>
         <w:gridCol w:w="1980"/>
@@ -5094,47 +5405,80 @@
       <w:tr>
         <w:trPr>
           <w:tblHeader w:val="on"/>
+          <w:tblHeader/>
         </w:trPr>
         <w:tc>
-          <w:tcPr/>
-          <w:p>
-            <w:pPr>
-              <w:pStyle w:val="Compact"/>
-            </w:pPr>
-            <w:r>
+          <w:tcPr>
+            <w:shd w:val="clear" w:color="auto" w:fill="EAF1F8"/>
+          </w:tcPr>
+          <w:p>
+            <w:pPr>
+              <w:pStyle w:val="Compact"/>
+              <w:spacing w:after="0" w:line="252" w:lineRule="auto"/>
+            </w:pPr>
+            <w:r>
+              <w:rPr>
+                <w:b/>
+                <w:color w:val="1F4E79"/>
+                <w:sz w:val="19"/>
+              </w:rPr>
               <w:t xml:space="preserve">Code</w:t>
             </w:r>
           </w:p>
         </w:tc>
         <w:tc>
-          <w:tcPr/>
-          <w:p>
-            <w:pPr>
-              <w:pStyle w:val="Compact"/>
-            </w:pPr>
-            <w:r>
+          <w:tcPr>
+            <w:shd w:val="clear" w:color="auto" w:fill="EAF1F8"/>
+          </w:tcPr>
+          <w:p>
+            <w:pPr>
+              <w:pStyle w:val="Compact"/>
+              <w:spacing w:after="0" w:line="252" w:lineRule="auto"/>
+            </w:pPr>
+            <w:r>
+              <w:rPr>
+                <w:b/>
+                <w:color w:val="1F4E79"/>
+                <w:sz w:val="19"/>
+              </w:rPr>
               <w:t xml:space="preserve">Severity</w:t>
             </w:r>
           </w:p>
         </w:tc>
         <w:tc>
-          <w:tcPr/>
-          <w:p>
-            <w:pPr>
-              <w:pStyle w:val="Compact"/>
-            </w:pPr>
-            <w:r>
+          <w:tcPr>
+            <w:shd w:val="clear" w:color="auto" w:fill="EAF1F8"/>
+          </w:tcPr>
+          <w:p>
+            <w:pPr>
+              <w:pStyle w:val="Compact"/>
+              <w:spacing w:after="0" w:line="252" w:lineRule="auto"/>
+            </w:pPr>
+            <w:r>
+              <w:rPr>
+                <w:b/>
+                <w:color w:val="1F4E79"/>
+                <w:sz w:val="19"/>
+              </w:rPr>
               <w:t xml:space="preserve">Meaning</w:t>
             </w:r>
           </w:p>
         </w:tc>
         <w:tc>
-          <w:tcPr/>
-          <w:p>
-            <w:pPr>
-              <w:pStyle w:val="Compact"/>
-            </w:pPr>
-            <w:r>
+          <w:tcPr>
+            <w:shd w:val="clear" w:color="auto" w:fill="EAF1F8"/>
+          </w:tcPr>
+          <w:p>
+            <w:pPr>
+              <w:pStyle w:val="Compact"/>
+              <w:spacing w:after="0" w:line="252" w:lineRule="auto"/>
+            </w:pPr>
+            <w:r>
+              <w:rPr>
+                <w:b/>
+                <w:color w:val="1F4E79"/>
+                <w:sz w:val="19"/>
+              </w:rPr>
               <w:t xml:space="preserve">Fix</w:t>
             </w:r>
           </w:p>
@@ -5146,10 +5490,12 @@
           <w:p>
             <w:pPr>
               <w:pStyle w:val="Compact"/>
+              <w:spacing w:after="0" w:line="252" w:lineRule="auto"/>
             </w:pPr>
             <w:r>
               <w:rPr>
                 <w:rStyle w:val="VerbatimChar"/>
+                <w:sz w:val="19"/>
               </w:rPr>
               <w:t xml:space="preserve">no_rig</w:t>
             </w:r>
@@ -5160,8 +5506,12 @@
           <w:p>
             <w:pPr>
               <w:pStyle w:val="Compact"/>
-            </w:pPr>
-            <w:r>
+              <w:spacing w:after="0" w:line="252" w:lineRule="auto"/>
+            </w:pPr>
+            <w:r>
+              <w:rPr>
+                <w:sz w:val="19"/>
+              </w:rPr>
               <w:t xml:space="preserve">error</w:t>
             </w:r>
           </w:p>
@@ -5171,9 +5521,13 @@
           <w:p>
             <w:pPr>
               <w:pStyle w:val="Compact"/>
-            </w:pPr>
-            <w:r>
-              <w:t xml:space="preserve">The selected rig isn’t in the scene.</w:t>
+              <w:spacing w:after="0" w:line="252" w:lineRule="auto"/>
+            </w:pPr>
+            <w:r>
+              <w:rPr>
+                <w:sz w:val="19"/>
+              </w:rPr>
+              <w:t xml:space="preserve">The selected rig isn't in the scene.</w:t>
             </w:r>
           </w:p>
         </w:tc>
@@ -5182,8 +5536,12 @@
           <w:p>
             <w:pPr>
               <w:pStyle w:val="Compact"/>
-            </w:pPr>
-            <w:r>
+              <w:spacing w:after="0" w:line="252" w:lineRule="auto"/>
+            </w:pPr>
+            <w:r>
+              <w:rPr>
+                <w:sz w:val="19"/>
+              </w:rPr>
               <w:t xml:space="preserve">Load that rig, or pick the rig that is in the scene.</w:t>
             </w:r>
           </w:p>
@@ -5195,10 +5553,12 @@
           <w:p>
             <w:pPr>
               <w:pStyle w:val="Compact"/>
+              <w:spacing w:after="0" w:line="252" w:lineRule="auto"/>
             </w:pPr>
             <w:r>
               <w:rPr>
                 <w:rStyle w:val="VerbatimChar"/>
+                <w:sz w:val="19"/>
               </w:rPr>
               <w:t xml:space="preserve">rig_mismatch</w:t>
             </w:r>
@@ -5209,8 +5569,12 @@
           <w:p>
             <w:pPr>
               <w:pStyle w:val="Compact"/>
-            </w:pPr>
-            <w:r>
+              <w:spacing w:after="0" w:line="252" w:lineRule="auto"/>
+            </w:pPr>
+            <w:r>
+              <w:rPr>
+                <w:sz w:val="19"/>
+              </w:rPr>
               <w:t xml:space="preserve">error</w:t>
             </w:r>
           </w:p>
@@ -5220,8 +5584,12 @@
           <w:p>
             <w:pPr>
               <w:pStyle w:val="Compact"/>
-            </w:pPr>
-            <w:r>
+              <w:spacing w:after="0" w:line="252" w:lineRule="auto"/>
+            </w:pPr>
+            <w:r>
+              <w:rPr>
+                <w:sz w:val="19"/>
+              </w:rPr>
               <w:t xml:space="preserve">The asset was built for a different rig.</w:t>
             </w:r>
           </w:p>
@@ -5231,24 +5599,38 @@
           <w:p>
             <w:pPr>
               <w:pStyle w:val="Compact"/>
-            </w:pPr>
-            <w:r>
+              <w:spacing w:after="0" w:line="252" w:lineRule="auto"/>
+            </w:pPr>
+            <w:r>
+              <w:rPr>
+                <w:sz w:val="19"/>
+              </w:rPr>
               <w:t xml:space="preserve">Use an asset for this rig, or</w:t>
             </w:r>
             <w:r>
+              <w:rPr>
+                <w:sz w:val="19"/>
+              </w:rPr>
               <w:t xml:space="preserve"> </w:t>
             </w:r>
             <w:r>
               <w:rPr>
                 <w:b/>
                 <w:bCs/>
+                <w:sz w:val="19"/>
               </w:rPr>
               <w:t xml:space="preserve">Retarget to…</w:t>
             </w:r>
             <w:r>
+              <w:rPr>
+                <w:sz w:val="19"/>
+              </w:rPr>
               <w:t xml:space="preserve"> </w:t>
             </w:r>
             <w:r>
+              <w:rPr>
+                <w:sz w:val="19"/>
+              </w:rPr>
               <w:t xml:space="preserve">it.</w:t>
             </w:r>
           </w:p>
@@ -5260,10 +5642,12 @@
           <w:p>
             <w:pPr>
               <w:pStyle w:val="Compact"/>
+              <w:spacing w:after="0" w:line="252" w:lineRule="auto"/>
             </w:pPr>
             <w:r>
               <w:rPr>
                 <w:rStyle w:val="VerbatimChar"/>
+                <w:sz w:val="19"/>
               </w:rPr>
               <w:t xml:space="preserve">version_unknown</w:t>
             </w:r>
@@ -5274,8 +5658,12 @@
           <w:p>
             <w:pPr>
               <w:pStyle w:val="Compact"/>
-            </w:pPr>
-            <w:r>
+              <w:spacing w:after="0" w:line="252" w:lineRule="auto"/>
+            </w:pPr>
+            <w:r>
+              <w:rPr>
+                <w:sz w:val="19"/>
+              </w:rPr>
               <w:t xml:space="preserve">warning</w:t>
             </w:r>
           </w:p>
@@ -5285,9 +5673,13 @@
           <w:p>
             <w:pPr>
               <w:pStyle w:val="Compact"/>
-            </w:pPr>
-            <w:r>
-              <w:t xml:space="preserve">The scene’s rig version couldn’t be detected.</w:t>
+              <w:spacing w:after="0" w:line="252" w:lineRule="auto"/>
+            </w:pPr>
+            <w:r>
+              <w:rPr>
+                <w:sz w:val="19"/>
+              </w:rPr>
+              <w:t xml:space="preserve">The scene's rig version couldn't be detected.</w:t>
             </w:r>
           </w:p>
         </w:tc>
@@ -5296,8 +5688,12 @@
           <w:p>
             <w:pPr>
               <w:pStyle w:val="Compact"/>
-            </w:pPr>
-            <w:r>
+              <w:spacing w:after="0" w:line="252" w:lineRule="auto"/>
+            </w:pPr>
+            <w:r>
+              <w:rPr>
+                <w:sz w:val="19"/>
+              </w:rPr>
               <w:t xml:space="preserve">The version check is skipped, not failed.</w:t>
             </w:r>
           </w:p>
@@ -5309,10 +5705,12 @@
           <w:p>
             <w:pPr>
               <w:pStyle w:val="Compact"/>
+              <w:spacing w:after="0" w:line="252" w:lineRule="auto"/>
             </w:pPr>
             <w:r>
               <w:rPr>
                 <w:rStyle w:val="VerbatimChar"/>
+                <w:sz w:val="19"/>
               </w:rPr>
               <w:t xml:space="preserve">version_incompat</w:t>
             </w:r>
@@ -5323,8 +5721,12 @@
           <w:p>
             <w:pPr>
               <w:pStyle w:val="Compact"/>
-            </w:pPr>
-            <w:r>
+              <w:spacing w:after="0" w:line="252" w:lineRule="auto"/>
+            </w:pPr>
+            <w:r>
+              <w:rPr>
+                <w:sz w:val="19"/>
+              </w:rPr>
               <w:t xml:space="preserve">error</w:t>
             </w:r>
           </w:p>
@@ -5334,9 +5736,13 @@
           <w:p>
             <w:pPr>
               <w:pStyle w:val="Compact"/>
-            </w:pPr>
-            <w:r>
-              <w:t xml:space="preserve">The asset’s rig versions don’t include this scene’s version.</w:t>
+              <w:spacing w:after="0" w:line="252" w:lineRule="auto"/>
+            </w:pPr>
+            <w:r>
+              <w:rPr>
+                <w:sz w:val="19"/>
+              </w:rPr>
+              <w:t xml:space="preserve">The asset's rig versions don't include this scene's version.</w:t>
             </w:r>
           </w:p>
         </w:tc>
@@ -5345,8 +5751,12 @@
           <w:p>
             <w:pPr>
               <w:pStyle w:val="Compact"/>
-            </w:pPr>
-            <w:r>
+              <w:spacing w:after="0" w:line="252" w:lineRule="auto"/>
+            </w:pPr>
+            <w:r>
+              <w:rPr>
+                <w:sz w:val="19"/>
+              </w:rPr>
               <w:t xml:space="preserve">Use an asset that covers this build of the rig.</w:t>
             </w:r>
           </w:p>
@@ -5358,25 +5768,37 @@
           <w:p>
             <w:pPr>
               <w:pStyle w:val="Compact"/>
+              <w:spacing w:after="0" w:line="252" w:lineRule="auto"/>
             </w:pPr>
             <w:r>
               <w:rPr>
                 <w:rStyle w:val="VerbatimChar"/>
+                <w:sz w:val="19"/>
               </w:rPr>
               <w:t xml:space="preserve">ns_in_use</w:t>
             </w:r>
             <w:r>
+              <w:rPr>
+                <w:sz w:val="19"/>
+              </w:rPr>
               <w:t xml:space="preserve"> </w:t>
             </w:r>
             <w:r>
+              <w:rPr>
+                <w:sz w:val="19"/>
+              </w:rPr>
               <w:t xml:space="preserve">/</w:t>
             </w:r>
             <w:r>
+              <w:rPr>
+                <w:sz w:val="19"/>
+              </w:rPr>
               <w:t xml:space="preserve"> </w:t>
             </w:r>
             <w:r>
               <w:rPr>
                 <w:rStyle w:val="VerbatimChar"/>
+                <w:sz w:val="19"/>
               </w:rPr>
               <w:t xml:space="preserve">ns_exists</w:t>
             </w:r>
@@ -5387,8 +5809,12 @@
           <w:p>
             <w:pPr>
               <w:pStyle w:val="Compact"/>
-            </w:pPr>
-            <w:r>
+              <w:spacing w:after="0" w:line="252" w:lineRule="auto"/>
+            </w:pPr>
+            <w:r>
+              <w:rPr>
+                <w:sz w:val="19"/>
+              </w:rPr>
               <w:t xml:space="preserve">error</w:t>
             </w:r>
           </w:p>
@@ -5398,8 +5824,12 @@
           <w:p>
             <w:pPr>
               <w:pStyle w:val="Compact"/>
-            </w:pPr>
-            <w:r>
+              <w:spacing w:after="0" w:line="252" w:lineRule="auto"/>
+            </w:pPr>
+            <w:r>
+              <w:rPr>
+                <w:sz w:val="19"/>
+              </w:rPr>
               <w:t xml:space="preserve">The instance name is already taken.</w:t>
             </w:r>
           </w:p>
@@ -5409,8 +5839,12 @@
           <w:p>
             <w:pPr>
               <w:pStyle w:val="Compact"/>
-            </w:pPr>
-            <w:r>
+              <w:spacing w:after="0" w:line="252" w:lineRule="auto"/>
+            </w:pPr>
+            <w:r>
+              <w:rPr>
+                <w:sz w:val="19"/>
+              </w:rPr>
               <w:t xml:space="preserve">Choose a different instance name.</w:t>
             </w:r>
           </w:p>
@@ -5422,10 +5856,12 @@
           <w:p>
             <w:pPr>
               <w:pStyle w:val="Compact"/>
+              <w:spacing w:after="0" w:line="252" w:lineRule="auto"/>
             </w:pPr>
             <w:r>
               <w:rPr>
                 <w:rStyle w:val="VerbatimChar"/>
+                <w:sz w:val="19"/>
               </w:rPr>
               <w:t xml:space="preserve">genie_missing</w:t>
             </w:r>
@@ -5436,8 +5872,12 @@
           <w:p>
             <w:pPr>
               <w:pStyle w:val="Compact"/>
-            </w:pPr>
-            <w:r>
+              <w:spacing w:after="0" w:line="252" w:lineRule="auto"/>
+            </w:pPr>
+            <w:r>
+              <w:rPr>
+                <w:sz w:val="19"/>
+              </w:rPr>
               <w:t xml:space="preserve">error</w:t>
             </w:r>
           </w:p>
@@ -5447,8 +5887,12 @@
           <w:p>
             <w:pPr>
               <w:pStyle w:val="Compact"/>
-            </w:pPr>
-            <w:r>
+              <w:spacing w:after="0" w:line="252" w:lineRule="auto"/>
+            </w:pPr>
+            <w:r>
+              <w:rPr>
+                <w:sz w:val="19"/>
+              </w:rPr>
               <w:t xml:space="preserve">A Genie-required node is missing.</w:t>
             </w:r>
           </w:p>
@@ -5458,32 +5902,43 @@
           <w:p>
             <w:pPr>
               <w:pStyle w:val="Compact"/>
-            </w:pPr>
-            <w:r>
+              <w:spacing w:after="0" w:line="252" w:lineRule="auto"/>
+            </w:pPr>
+            <w:r>
+              <w:rPr>
+                <w:sz w:val="19"/>
+              </w:rPr>
               <w:t xml:space="preserve">Make sure the export-required node exists (see</w:t>
             </w:r>
             <w:r>
+              <w:rPr>
+                <w:sz w:val="19"/>
+              </w:rPr>
               <w:t xml:space="preserve"> </w:t>
             </w:r>
             <w:r>
               <w:rPr>
                 <w:i/>
                 <w:iCs/>
+                <w:sz w:val="19"/>
               </w:rPr>
               <w:t xml:space="preserve">Genie export</w:t>
             </w:r>
             <w:r>
+              <w:rPr>
+                <w:sz w:val="19"/>
+              </w:rPr>
               <w:t xml:space="preserve">).</w:t>
             </w:r>
           </w:p>
         </w:tc>
       </w:tr>
     </w:tbl>
-    <w:bookmarkEnd w:id="45"/>
-    <w:bookmarkStart w:id="46" w:name="Xed123396cf9c5fbb4215834b70786d870033936"/>
-    <w:p>
-      <w:pPr>
-        <w:pStyle w:val="Heading3"/>
+    <w:bookmarkEnd w:id="54"/>
+    <w:bookmarkStart w:id="55" w:name="Xed123396cf9c5fbb4215834b70786d870033936"/>
+    <w:p>
+      <w:pPr>
+        <w:pStyle w:val="Heading2"/>
       </w:pPr>
       <w:r>
         <w:t xml:space="preserve">Stage C - connecting joints (during attach; rolls back automatically)</w:t>
@@ -5492,9 +5947,23 @@
     <w:tbl>
       <w:tblPr>
         <w:tblStyle w:val="Table"/>
-        <w:tblW w:type="pct" w:w="5000"/>
-        <w:tblLayout w:type="fixed"/>
+        <w:tblW w:type="auto" w:w="0"/>
+        <w:jc w:val="center"/>
         <w:tblLook w:firstRow="1" w:lastRow="0" w:firstColumn="0" w:lastColumn="0" w:noHBand="0" w:noVBand="0" w:val="0020"/>
+        <w:tblBorders>
+          <w:top w:val="single" w:sz="4" w:space="0" w:color="BFBFBF"/>
+          <w:bottom w:val="single" w:sz="4" w:space="0" w:color="BFBFBF"/>
+          <w:insideH w:val="single" w:sz="4" w:space="0" w:color="BFBFBF"/>
+          <w:left w:val="single" w:sz="4" w:space="0" w:color="BFBFBF"/>
+          <w:right w:val="single" w:sz="4" w:space="0" w:color="BFBFBF"/>
+          <w:insideV w:val="single" w:sz="4" w:space="0" w:color="BFBFBF"/>
+        </w:tblBorders>
+        <w:tblCellMar>
+          <w:top w:w="50" w:type="dxa"/>
+          <w:bottom w:w="50" w:type="dxa"/>
+          <w:left w:w="100" w:type="dxa"/>
+          <w:right w:w="100" w:type="dxa"/>
+        </w:tblCellMar>
       </w:tblPr>
       <w:tblGrid>
         <w:gridCol w:w="3960"/>
@@ -5503,25 +5972,42 @@
       <w:tr>
         <w:trPr>
           <w:tblHeader w:val="on"/>
+          <w:tblHeader/>
         </w:trPr>
         <w:tc>
-          <w:tcPr/>
-          <w:p>
-            <w:pPr>
-              <w:pStyle w:val="Compact"/>
-            </w:pPr>
-            <w:r>
+          <w:tcPr>
+            <w:shd w:val="clear" w:color="auto" w:fill="EAF1F8"/>
+          </w:tcPr>
+          <w:p>
+            <w:pPr>
+              <w:pStyle w:val="Compact"/>
+              <w:spacing w:after="0" w:line="252" w:lineRule="auto"/>
+            </w:pPr>
+            <w:r>
+              <w:rPr>
+                <w:b/>
+                <w:color w:val="1F4E79"/>
+                <w:sz w:val="19"/>
+              </w:rPr>
               <w:t xml:space="preserve">Code</w:t>
             </w:r>
           </w:p>
         </w:tc>
         <w:tc>
-          <w:tcPr/>
-          <w:p>
-            <w:pPr>
-              <w:pStyle w:val="Compact"/>
-            </w:pPr>
-            <w:r>
+          <w:tcPr>
+            <w:shd w:val="clear" w:color="auto" w:fill="EAF1F8"/>
+          </w:tcPr>
+          <w:p>
+            <w:pPr>
+              <w:pStyle w:val="Compact"/>
+              <w:spacing w:after="0" w:line="252" w:lineRule="auto"/>
+            </w:pPr>
+            <w:r>
+              <w:rPr>
+                <w:b/>
+                <w:color w:val="1F4E79"/>
+                <w:sz w:val="19"/>
+              </w:rPr>
               <w:t xml:space="preserve">Meaning</w:t>
             </w:r>
           </w:p>
@@ -5533,10 +6019,12 @@
           <w:p>
             <w:pPr>
               <w:pStyle w:val="Compact"/>
+              <w:spacing w:after="0" w:line="252" w:lineRule="auto"/>
             </w:pPr>
             <w:r>
               <w:rPr>
                 <w:rStyle w:val="VerbatimChar"/>
+                <w:sz w:val="19"/>
               </w:rPr>
               <w:t xml:space="preserve">no_joint_match</w:t>
             </w:r>
@@ -5547,23 +6035,37 @@
           <w:p>
             <w:pPr>
               <w:pStyle w:val="Compact"/>
-            </w:pPr>
-            <w:r>
+              <w:spacing w:after="0" w:line="252" w:lineRule="auto"/>
+            </w:pPr>
+            <w:r>
+              <w:rPr>
+                <w:sz w:val="19"/>
+              </w:rPr>
               <w:t xml:space="preserve">No</w:t>
             </w:r>
             <w:r>
+              <w:rPr>
+                <w:sz w:val="19"/>
+              </w:rPr>
               <w:t xml:space="preserve"> </w:t>
             </w:r>
             <w:r>
               <w:rPr>
                 <w:rStyle w:val="VerbatimChar"/>
+                <w:sz w:val="19"/>
               </w:rPr>
               <w:t xml:space="preserve">cloth_*</w:t>
             </w:r>
             <w:r>
+              <w:rPr>
+                <w:sz w:val="19"/>
+              </w:rPr>
               <w:t xml:space="preserve"> </w:t>
             </w:r>
             <w:r>
+              <w:rPr>
+                <w:sz w:val="19"/>
+              </w:rPr>
               <w:t xml:space="preserve">joint matched a body joint (check exact names).</w:t>
             </w:r>
           </w:p>
@@ -5575,10 +6077,12 @@
           <w:p>
             <w:pPr>
               <w:pStyle w:val="Compact"/>
+              <w:spacing w:after="0" w:line="252" w:lineRule="auto"/>
             </w:pPr>
             <w:r>
               <w:rPr>
                 <w:rStyle w:val="VerbatimChar"/>
+                <w:sz w:val="19"/>
               </w:rPr>
               <w:t xml:space="preserve">cloth_joint_missing</w:t>
             </w:r>
@@ -5589,9 +6093,13 @@
           <w:p>
             <w:pPr>
               <w:pStyle w:val="Compact"/>
-            </w:pPr>
-            <w:r>
-              <w:t xml:space="preserve">A matched joint wasn’t found after import.</w:t>
+              <w:spacing w:after="0" w:line="252" w:lineRule="auto"/>
+            </w:pPr>
+            <w:r>
+              <w:rPr>
+                <w:sz w:val="19"/>
+              </w:rPr>
+              <w:t xml:space="preserve">A matched joint wasn't found after import.</w:t>
             </w:r>
           </w:p>
         </w:tc>
@@ -5602,40 +6110,62 @@
           <w:p>
             <w:pPr>
               <w:pStyle w:val="Compact"/>
+              <w:spacing w:after="0" w:line="252" w:lineRule="auto"/>
             </w:pPr>
             <w:r>
               <w:rPr>
                 <w:rStyle w:val="VerbatimChar"/>
+                <w:sz w:val="19"/>
               </w:rPr>
               <w:t xml:space="preserve">attr_missing</w:t>
             </w:r>
             <w:r>
+              <w:rPr>
+                <w:sz w:val="19"/>
+              </w:rPr>
               <w:t xml:space="preserve"> </w:t>
             </w:r>
             <w:r>
+              <w:rPr>
+                <w:sz w:val="19"/>
+              </w:rPr>
               <w:t xml:space="preserve">/</w:t>
             </w:r>
             <w:r>
+              <w:rPr>
+                <w:sz w:val="19"/>
+              </w:rPr>
               <w:t xml:space="preserve"> </w:t>
             </w:r>
             <w:r>
               <w:rPr>
                 <w:rStyle w:val="VerbatimChar"/>
+                <w:sz w:val="19"/>
               </w:rPr>
               <w:t xml:space="preserve">attr_locked</w:t>
             </w:r>
             <w:r>
+              <w:rPr>
+                <w:sz w:val="19"/>
+              </w:rPr>
               <w:t xml:space="preserve"> </w:t>
             </w:r>
             <w:r>
+              <w:rPr>
+                <w:sz w:val="19"/>
+              </w:rPr>
               <w:t xml:space="preserve">/</w:t>
             </w:r>
             <w:r>
+              <w:rPr>
+                <w:sz w:val="19"/>
+              </w:rPr>
               <w:t xml:space="preserve"> </w:t>
             </w:r>
             <w:r>
               <w:rPr>
                 <w:rStyle w:val="VerbatimChar"/>
+                <w:sz w:val="19"/>
               </w:rPr>
               <w:t xml:space="preserve">attr_connected</w:t>
             </w:r>
@@ -5646,8 +6176,12 @@
           <w:p>
             <w:pPr>
               <w:pStyle w:val="Compact"/>
-            </w:pPr>
-            <w:r>
+              <w:spacing w:after="0" w:line="252" w:lineRule="auto"/>
+            </w:pPr>
+            <w:r>
+              <w:rPr>
+                <w:sz w:val="19"/>
+              </w:rPr>
               <w:t xml:space="preserve">A translate, rotate or scale channel is missing, locked, or already driven. Unlock or free it first.</w:t>
             </w:r>
           </w:p>
@@ -5659,25 +6193,37 @@
           <w:p>
             <w:pPr>
               <w:pStyle w:val="Compact"/>
+              <w:spacing w:after="0" w:line="252" w:lineRule="auto"/>
             </w:pPr>
             <w:r>
               <w:rPr>
                 <w:rStyle w:val="VerbatimChar"/>
+                <w:sz w:val="19"/>
               </w:rPr>
               <w:t xml:space="preserve">no_body_joints</w:t>
             </w:r>
             <w:r>
+              <w:rPr>
+                <w:sz w:val="19"/>
+              </w:rPr>
               <w:t xml:space="preserve"> </w:t>
             </w:r>
             <w:r>
+              <w:rPr>
+                <w:sz w:val="19"/>
+              </w:rPr>
               <w:t xml:space="preserve">/</w:t>
             </w:r>
             <w:r>
+              <w:rPr>
+                <w:sz w:val="19"/>
+              </w:rPr>
               <w:t xml:space="preserve"> </w:t>
             </w:r>
             <w:r>
               <w:rPr>
                 <w:rStyle w:val="VerbatimChar"/>
+                <w:sz w:val="19"/>
               </w:rPr>
               <w:t xml:space="preserve">ambiguous_body_joint</w:t>
             </w:r>
@@ -5688,8 +6234,12 @@
           <w:p>
             <w:pPr>
               <w:pStyle w:val="Compact"/>
-            </w:pPr>
-            <w:r>
+              <w:spacing w:after="0" w:line="252" w:lineRule="auto"/>
+            </w:pPr>
+            <w:r>
+              <w:rPr>
+                <w:sz w:val="19"/>
+              </w:rPr>
               <w:t xml:space="preserve">The export skeleton has no joints, or a joint name is ambiguous within it.</w:t>
             </w:r>
           </w:p>
@@ -5701,25 +6251,37 @@
           <w:p>
             <w:pPr>
               <w:pStyle w:val="Compact"/>
+              <w:spacing w:after="0" w:line="252" w:lineRule="auto"/>
             </w:pPr>
             <w:r>
               <w:rPr>
                 <w:rStyle w:val="VerbatimChar"/>
+                <w:sz w:val="19"/>
               </w:rPr>
               <w:t xml:space="preserve">import_failed</w:t>
             </w:r>
             <w:r>
+              <w:rPr>
+                <w:sz w:val="19"/>
+              </w:rPr>
               <w:t xml:space="preserve"> </w:t>
             </w:r>
             <w:r>
+              <w:rPr>
+                <w:sz w:val="19"/>
+              </w:rPr>
               <w:t xml:space="preserve">/</w:t>
             </w:r>
             <w:r>
+              <w:rPr>
+                <w:sz w:val="19"/>
+              </w:rPr>
               <w:t xml:space="preserve"> </w:t>
             </w:r>
             <w:r>
               <w:rPr>
                 <w:rStyle w:val="VerbatimChar"/>
+                <w:sz w:val="19"/>
               </w:rPr>
               <w:t xml:space="preserve">attach_failed</w:t>
             </w:r>
@@ -5730,9 +6292,13 @@
           <w:p>
             <w:pPr>
               <w:pStyle w:val="Compact"/>
-            </w:pPr>
-            <w:r>
-              <w:t xml:space="preserve">Maya couldn’t import the asset or make a connection; the scene was rolled back.</w:t>
+              <w:spacing w:after="0" w:line="252" w:lineRule="auto"/>
+            </w:pPr>
+            <w:r>
+              <w:rPr>
+                <w:sz w:val="19"/>
+              </w:rPr>
+              <w:t xml:space="preserve">Maya couldn't import the asset or make a connection; the scene was rolled back.</w:t>
             </w:r>
           </w:p>
         </w:tc>
@@ -5745,12 +6311,12 @@
         </w:pict>
       </w:r>
     </w:p>
-    <w:bookmarkEnd w:id="46"/>
-    <w:bookmarkEnd w:id="47"/>
-    <w:bookmarkStart w:id="48" w:name="troubleshooting"/>
-    <w:p>
-      <w:pPr>
-        <w:pStyle w:val="Heading2"/>
+    <w:bookmarkEnd w:id="55"/>
+    <w:bookmarkEnd w:id="56"/>
+    <w:bookmarkStart w:id="57" w:name="X604d32d4245089c058c4a17a722c369f414c972"/>
+    <w:p>
+      <w:pPr>
+        <w:pStyle w:val="Heading1"/>
       </w:pPr>
       <w:r>
         <w:t xml:space="preserve">9. Troubleshooting</w:t>
@@ -5759,9 +6325,23 @@
     <w:tbl>
       <w:tblPr>
         <w:tblStyle w:val="Table"/>
-        <w:tblW w:type="pct" w:w="5000"/>
-        <w:tblLayout w:type="fixed"/>
+        <w:tblW w:type="auto" w:w="0"/>
+        <w:jc w:val="center"/>
         <w:tblLook w:firstRow="1" w:lastRow="0" w:firstColumn="0" w:lastColumn="0" w:noHBand="0" w:noVBand="0" w:val="0020"/>
+        <w:tblBorders>
+          <w:top w:val="single" w:sz="4" w:space="0" w:color="BFBFBF"/>
+          <w:bottom w:val="single" w:sz="4" w:space="0" w:color="BFBFBF"/>
+          <w:insideH w:val="single" w:sz="4" w:space="0" w:color="BFBFBF"/>
+          <w:left w:val="single" w:sz="4" w:space="0" w:color="BFBFBF"/>
+          <w:right w:val="single" w:sz="4" w:space="0" w:color="BFBFBF"/>
+          <w:insideV w:val="single" w:sz="4" w:space="0" w:color="BFBFBF"/>
+        </w:tblBorders>
+        <w:tblCellMar>
+          <w:top w:w="50" w:type="dxa"/>
+          <w:bottom w:w="50" w:type="dxa"/>
+          <w:left w:w="100" w:type="dxa"/>
+          <w:right w:w="100" w:type="dxa"/>
+        </w:tblCellMar>
       </w:tblPr>
       <w:tblGrid>
         <w:gridCol w:w="3960"/>
@@ -5770,25 +6350,42 @@
       <w:tr>
         <w:trPr>
           <w:tblHeader w:val="on"/>
+          <w:tblHeader/>
         </w:trPr>
         <w:tc>
-          <w:tcPr/>
-          <w:p>
-            <w:pPr>
-              <w:pStyle w:val="Compact"/>
-            </w:pPr>
-            <w:r>
+          <w:tcPr>
+            <w:shd w:val="clear" w:color="auto" w:fill="EAF1F8"/>
+          </w:tcPr>
+          <w:p>
+            <w:pPr>
+              <w:pStyle w:val="Compact"/>
+              <w:spacing w:after="0" w:line="252" w:lineRule="auto"/>
+            </w:pPr>
+            <w:r>
+              <w:rPr>
+                <w:b/>
+                <w:color w:val="1F4E79"/>
+                <w:sz w:val="19"/>
+              </w:rPr>
               <w:t xml:space="preserve">Symptom</w:t>
             </w:r>
           </w:p>
         </w:tc>
         <w:tc>
-          <w:tcPr/>
-          <w:p>
-            <w:pPr>
-              <w:pStyle w:val="Compact"/>
-            </w:pPr>
-            <w:r>
+          <w:tcPr>
+            <w:shd w:val="clear" w:color="auto" w:fill="EAF1F8"/>
+          </w:tcPr>
+          <w:p>
+            <w:pPr>
+              <w:pStyle w:val="Compact"/>
+              <w:spacing w:after="0" w:line="252" w:lineRule="auto"/>
+            </w:pPr>
+            <w:r>
+              <w:rPr>
+                <w:b/>
+                <w:color w:val="1F4E79"/>
+                <w:sz w:val="19"/>
+              </w:rPr>
               <w:t xml:space="preserve">Likely cause / fix</w:t>
             </w:r>
           </w:p>
@@ -5800,24 +6397,38 @@
           <w:p>
             <w:pPr>
               <w:pStyle w:val="Compact"/>
-            </w:pPr>
-            <w:r>
+              <w:spacing w:after="0" w:line="252" w:lineRule="auto"/>
+            </w:pPr>
+            <w:r>
+              <w:rPr>
+                <w:sz w:val="19"/>
+              </w:rPr>
               <w:t xml:space="preserve">Asset shows as</w:t>
             </w:r>
             <w:r>
+              <w:rPr>
+                <w:sz w:val="19"/>
+              </w:rPr>
               <w:t xml:space="preserve"> </w:t>
             </w:r>
             <w:r>
               <w:rPr>
                 <w:b/>
                 <w:bCs/>
+                <w:sz w:val="19"/>
               </w:rPr>
               <w:t xml:space="preserve">invalid</w:t>
             </w:r>
             <w:r>
+              <w:rPr>
+                <w:sz w:val="19"/>
+              </w:rPr>
               <w:t xml:space="preserve"> </w:t>
             </w:r>
             <w:r>
+              <w:rPr>
+                <w:sz w:val="19"/>
+              </w:rPr>
               <w:t xml:space="preserve">in the browser</w:t>
             </w:r>
           </w:p>
@@ -5827,8 +6438,12 @@
           <w:p>
             <w:pPr>
               <w:pStyle w:val="Compact"/>
-            </w:pPr>
-            <w:r>
+              <w:spacing w:after="0" w:line="252" w:lineRule="auto"/>
+            </w:pPr>
+            <w:r>
+              <w:rPr>
+                <w:sz w:val="19"/>
+              </w:rPr>
               <w:t xml:space="preserve">Open its details - the issues list names the validation codes (section 8). Usually missing details or a missing group.</w:t>
             </w:r>
           </w:p>
@@ -5840,17 +6455,25 @@
           <w:p>
             <w:pPr>
               <w:pStyle w:val="Compact"/>
-            </w:pPr>
-            <w:r>
+              <w:spacing w:after="0" w:line="252" w:lineRule="auto"/>
+            </w:pPr>
+            <w:r>
+              <w:rPr>
+                <w:sz w:val="19"/>
+              </w:rPr>
               <w:t xml:space="preserve">Attach says</w:t>
             </w:r>
             <w:r>
+              <w:rPr>
+                <w:sz w:val="19"/>
+              </w:rPr>
               <w:t xml:space="preserve"> </w:t>
             </w:r>
             <w:r>
               <w:rPr>
                 <w:b/>
                 <w:bCs/>
+                <w:sz w:val="19"/>
               </w:rPr>
               <w:t xml:space="preserve">rig not found</w:t>
             </w:r>
@@ -5861,25 +6484,39 @@
           <w:p>
             <w:pPr>
               <w:pStyle w:val="Compact"/>
-            </w:pPr>
-            <w:r>
+              <w:spacing w:after="0" w:line="252" w:lineRule="auto"/>
+            </w:pPr>
+            <w:r>
+              <w:rPr>
+                <w:sz w:val="19"/>
+              </w:rPr>
               <w:t xml:space="preserve">The rig picked in the</w:t>
             </w:r>
             <w:r>
+              <w:rPr>
+                <w:sz w:val="19"/>
+              </w:rPr>
               <w:t xml:space="preserve"> </w:t>
             </w:r>
             <w:r>
               <w:rPr>
                 <w:b/>
                 <w:bCs/>
+                <w:sz w:val="19"/>
               </w:rPr>
               <w:t xml:space="preserve">Rig</w:t>
             </w:r>
             <w:r>
+              <w:rPr>
+                <w:sz w:val="19"/>
+              </w:rPr>
               <w:t xml:space="preserve"> </w:t>
             </w:r>
             <w:r>
-              <w:t xml:space="preserve">dropdown isn’t in the scene. Load it, or switch to the rig that is.</w:t>
+              <w:rPr>
+                <w:sz w:val="19"/>
+              </w:rPr>
+              <w:t xml:space="preserve">dropdown isn't in the scene. Load it, or switch to the rig that is.</w:t>
             </w:r>
           </w:p>
         </w:tc>
@@ -5890,17 +6527,25 @@
           <w:p>
             <w:pPr>
               <w:pStyle w:val="Compact"/>
-            </w:pPr>
-            <w:r>
+              <w:spacing w:after="0" w:line="252" w:lineRule="auto"/>
+            </w:pPr>
+            <w:r>
+              <w:rPr>
+                <w:sz w:val="19"/>
+              </w:rPr>
               <w:t xml:space="preserve">Attach says the asset is</w:t>
             </w:r>
             <w:r>
+              <w:rPr>
+                <w:sz w:val="19"/>
+              </w:rPr>
               <w:t xml:space="preserve"> </w:t>
             </w:r>
             <w:r>
               <w:rPr>
                 <w:b/>
                 <w:bCs/>
+                <w:sz w:val="19"/>
               </w:rPr>
               <w:t xml:space="preserve">built for another rig</w:t>
             </w:r>
@@ -5911,24 +6556,38 @@
           <w:p>
             <w:pPr>
               <w:pStyle w:val="Compact"/>
-            </w:pPr>
-            <w:r>
+              <w:spacing w:after="0" w:line="252" w:lineRule="auto"/>
+            </w:pPr>
+            <w:r>
+              <w:rPr>
+                <w:sz w:val="19"/>
+              </w:rPr>
               <w:t xml:space="preserve">A garment fits one rig only. Switch rigs, or right-click it and</w:t>
             </w:r>
             <w:r>
+              <w:rPr>
+                <w:sz w:val="19"/>
+              </w:rPr>
               <w:t xml:space="preserve"> </w:t>
             </w:r>
             <w:r>
               <w:rPr>
                 <w:b/>
                 <w:bCs/>
+                <w:sz w:val="19"/>
               </w:rPr>
               <w:t xml:space="preserve">Retarget to…</w:t>
             </w:r>
             <w:r>
+              <w:rPr>
+                <w:sz w:val="19"/>
+              </w:rPr>
               <w:t xml:space="preserve"> </w:t>
             </w:r>
             <w:r>
+              <w:rPr>
+                <w:sz w:val="19"/>
+              </w:rPr>
               <w:t xml:space="preserve">(then check the fit).</w:t>
             </w:r>
           </w:p>
@@ -5940,24 +6599,38 @@
           <w:p>
             <w:pPr>
               <w:pStyle w:val="Compact"/>
-            </w:pPr>
-            <w:r>
+              <w:spacing w:after="0" w:line="252" w:lineRule="auto"/>
+            </w:pPr>
+            <w:r>
+              <w:rPr>
+                <w:sz w:val="19"/>
+              </w:rPr>
               <w:t xml:space="preserve">An asset</w:t>
             </w:r>
             <w:r>
+              <w:rPr>
+                <w:sz w:val="19"/>
+              </w:rPr>
               <w:t xml:space="preserve"> </w:t>
             </w:r>
             <w:r>
               <w:rPr>
                 <w:b/>
                 <w:bCs/>
+                <w:sz w:val="19"/>
               </w:rPr>
               <w:t xml:space="preserve">vanished</w:t>
             </w:r>
             <w:r>
+              <w:rPr>
+                <w:sz w:val="19"/>
+              </w:rPr>
               <w:t xml:space="preserve"> </w:t>
             </w:r>
             <w:r>
+              <w:rPr>
+                <w:sz w:val="19"/>
+              </w:rPr>
               <w:t xml:space="preserve">from the browser</w:t>
             </w:r>
           </w:p>
@@ -5967,21 +6640,32 @@
           <w:p>
             <w:pPr>
               <w:pStyle w:val="Compact"/>
-            </w:pPr>
-            <w:r>
-              <w:t xml:space="preserve">It’s built for another rig. Tick</w:t>
-            </w:r>
-            <w:r>
+              <w:spacing w:after="0" w:line="252" w:lineRule="auto"/>
+            </w:pPr>
+            <w:r>
+              <w:rPr>
+                <w:sz w:val="19"/>
+              </w:rPr>
+              <w:t xml:space="preserve">It's built for another rig. Tick</w:t>
+            </w:r>
+            <w:r>
+              <w:rPr>
+                <w:sz w:val="19"/>
+              </w:rPr>
               <w:t xml:space="preserve"> </w:t>
             </w:r>
             <w:r>
               <w:rPr>
                 <w:b/>
                 <w:bCs/>
+                <w:sz w:val="19"/>
               </w:rPr>
               <w:t xml:space="preserve">Show other rigs</w:t>
             </w:r>
             <w:r>
+              <w:rPr>
+                <w:sz w:val="19"/>
+              </w:rPr>
               <w:t xml:space="preserve">.</w:t>
             </w:r>
           </w:p>
@@ -5993,17 +6677,25 @@
           <w:p>
             <w:pPr>
               <w:pStyle w:val="Compact"/>
-            </w:pPr>
-            <w:r>
+              <w:spacing w:after="0" w:line="252" w:lineRule="auto"/>
+            </w:pPr>
+            <w:r>
+              <w:rPr>
+                <w:sz w:val="19"/>
+              </w:rPr>
               <w:t xml:space="preserve">Attach says</w:t>
             </w:r>
             <w:r>
+              <w:rPr>
+                <w:sz w:val="19"/>
+              </w:rPr>
               <w:t xml:space="preserve"> </w:t>
             </w:r>
             <w:r>
               <w:rPr>
                 <w:b/>
                 <w:bCs/>
+                <w:sz w:val="19"/>
               </w:rPr>
               <w:t xml:space="preserve">no_joint_match</w:t>
             </w:r>
@@ -6014,56 +6706,88 @@
           <w:p>
             <w:pPr>
               <w:pStyle w:val="Compact"/>
-            </w:pPr>
-            <w:r>
+              <w:spacing w:after="0" w:line="252" w:lineRule="auto"/>
+            </w:pPr>
+            <w:r>
+              <w:rPr>
+                <w:sz w:val="19"/>
+              </w:rPr>
               <w:t xml:space="preserve">A</w:t>
             </w:r>
             <w:r>
+              <w:rPr>
+                <w:sz w:val="19"/>
+              </w:rPr>
               <w:t xml:space="preserve"> </w:t>
             </w:r>
             <w:r>
               <w:rPr>
                 <w:rStyle w:val="VerbatimChar"/>
+                <w:sz w:val="19"/>
               </w:rPr>
               <w:t xml:space="preserve">cloth_*</w:t>
             </w:r>
             <w:r>
+              <w:rPr>
+                <w:sz w:val="19"/>
+              </w:rPr>
               <w:t xml:space="preserve"> </w:t>
             </w:r>
             <w:r>
-              <w:t xml:space="preserve">joint name doesn’t exactly match a body joint (case,</w:t>
-            </w:r>
-            <w:r>
+              <w:rPr>
+                <w:sz w:val="19"/>
+              </w:rPr>
+              <w:t xml:space="preserve">joint name doesn't exactly match a body joint (case,</w:t>
+            </w:r>
+            <w:r>
+              <w:rPr>
+                <w:sz w:val="19"/>
+              </w:rPr>
               <w:t xml:space="preserve"> </w:t>
             </w:r>
             <w:r>
               <w:rPr>
                 <w:rStyle w:val="VerbatimChar"/>
+                <w:sz w:val="19"/>
               </w:rPr>
               <w:t xml:space="preserve">_l</w:t>
             </w:r>
             <w:r>
+              <w:rPr>
+                <w:sz w:val="19"/>
+              </w:rPr>
               <w:t xml:space="preserve">/</w:t>
             </w:r>
             <w:r>
               <w:rPr>
                 <w:rStyle w:val="VerbatimChar"/>
+                <w:sz w:val="19"/>
               </w:rPr>
               <w:t xml:space="preserve">_r</w:t>
             </w:r>
             <w:r>
+              <w:rPr>
+                <w:sz w:val="19"/>
+              </w:rPr>
               <w:t xml:space="preserve">, no</w:t>
             </w:r>
             <w:r>
+              <w:rPr>
+                <w:sz w:val="19"/>
+              </w:rPr>
               <w:t xml:space="preserve"> </w:t>
             </w:r>
             <w:r>
               <w:rPr>
                 <w:rStyle w:val="VerbatimChar"/>
+                <w:sz w:val="19"/>
               </w:rPr>
               <w:t xml:space="preserve">_jnt</w:t>
             </w:r>
             <w:r>
+              <w:rPr>
+                <w:sz w:val="19"/>
+              </w:rPr>
               <w:t xml:space="preserve">).</w:t>
             </w:r>
           </w:p>
@@ -6075,9 +6799,13 @@
           <w:p>
             <w:pPr>
               <w:pStyle w:val="Compact"/>
-            </w:pPr>
-            <w:r>
-              <w:t xml:space="preserve">Garment doesn’t follow the body</w:t>
+              <w:spacing w:after="0" w:line="252" w:lineRule="auto"/>
+            </w:pPr>
+            <w:r>
+              <w:rPr>
+                <w:sz w:val="19"/>
+              </w:rPr>
+              <w:t xml:space="preserve">Garment doesn't follow the body</w:t>
             </w:r>
           </w:p>
         </w:tc>
@@ -6086,21 +6814,32 @@
           <w:p>
             <w:pPr>
               <w:pStyle w:val="Compact"/>
-            </w:pPr>
-            <w:r>
-              <w:t xml:space="preserve">The joints didn’t connect - check names, and confirm the garment was attached with</w:t>
-            </w:r>
-            <w:r>
+              <w:spacing w:after="0" w:line="252" w:lineRule="auto"/>
+            </w:pPr>
+            <w:r>
+              <w:rPr>
+                <w:sz w:val="19"/>
+              </w:rPr>
+              <w:t xml:space="preserve">The joints didn't connect - check names, and confirm the garment was attached with</w:t>
+            </w:r>
+            <w:r>
+              <w:rPr>
+                <w:sz w:val="19"/>
+              </w:rPr>
               <w:t xml:space="preserve"> </w:t>
             </w:r>
             <w:r>
               <w:rPr>
                 <w:b/>
                 <w:bCs/>
+                <w:sz w:val="19"/>
               </w:rPr>
               <w:t xml:space="preserve">Attach</w:t>
             </w:r>
             <w:r>
+              <w:rPr>
+                <w:sz w:val="19"/>
+              </w:rPr>
               <w:t xml:space="preserve">, not just imported.</w:t>
             </w:r>
           </w:p>
@@ -6112,17 +6851,25 @@
           <w:p>
             <w:pPr>
               <w:pStyle w:val="Compact"/>
-            </w:pPr>
-            <w:r>
+              <w:spacing w:after="0" w:line="252" w:lineRule="auto"/>
+            </w:pPr>
+            <w:r>
+              <w:rPr>
+                <w:sz w:val="19"/>
+              </w:rPr>
               <w:t xml:space="preserve">A fixed garment still has the</w:t>
             </w:r>
             <w:r>
+              <w:rPr>
+                <w:sz w:val="19"/>
+              </w:rPr>
               <w:t xml:space="preserve"> </w:t>
             </w:r>
             <w:r>
               <w:rPr>
                 <w:b/>
                 <w:bCs/>
+                <w:sz w:val="19"/>
               </w:rPr>
               <w:t xml:space="preserve">old weights</w:t>
             </w:r>
@@ -6133,69 +6880,110 @@
           <w:p>
             <w:pPr>
               <w:pStyle w:val="Compact"/>
-            </w:pPr>
-            <w:r>
+              <w:spacing w:after="0" w:line="252" w:lineRule="auto"/>
+            </w:pPr>
+            <w:r>
+              <w:rPr>
+                <w:sz w:val="19"/>
+              </w:rPr>
               <w:t xml:space="preserve">The scene keeps the copy it was dressed with.</w:t>
             </w:r>
             <w:r>
+              <w:rPr>
+                <w:sz w:val="19"/>
+              </w:rPr>
               <w:t xml:space="preserve"> </w:t>
             </w:r>
             <w:r>
               <w:rPr>
                 <w:b/>
                 <w:bCs/>
+                <w:sz w:val="19"/>
               </w:rPr>
               <w:t xml:space="preserve">Sync</w:t>
             </w:r>
             <w:r>
+              <w:rPr>
+                <w:sz w:val="19"/>
+              </w:rPr>
               <w:t xml:space="preserve"> </w:t>
             </w:r>
             <w:r>
+              <w:rPr>
+                <w:sz w:val="19"/>
+              </w:rPr>
               <w:t xml:space="preserve">(or</w:t>
             </w:r>
             <w:r>
+              <w:rPr>
+                <w:sz w:val="19"/>
+              </w:rPr>
               <w:t xml:space="preserve"> </w:t>
             </w:r>
             <w:r>
               <w:rPr>
                 <w:b/>
                 <w:bCs/>
+                <w:sz w:val="19"/>
               </w:rPr>
               <w:t xml:space="preserve">Refresh</w:t>
             </w:r>
             <w:r>
+              <w:rPr>
+                <w:sz w:val="19"/>
+              </w:rPr>
               <w:t xml:space="preserve">), then</w:t>
             </w:r>
             <w:r>
+              <w:rPr>
+                <w:sz w:val="19"/>
+              </w:rPr>
               <w:t xml:space="preserve"> </w:t>
             </w:r>
             <w:r>
               <w:rPr>
                 <w:b/>
                 <w:bCs/>
+                <w:sz w:val="19"/>
               </w:rPr>
               <w:t xml:space="preserve">Detach</w:t>
             </w:r>
             <w:r>
+              <w:rPr>
+                <w:sz w:val="19"/>
+              </w:rPr>
               <w:t xml:space="preserve"> </w:t>
             </w:r>
             <w:r>
+              <w:rPr>
+                <w:sz w:val="19"/>
+              </w:rPr>
               <w:t xml:space="preserve">and</w:t>
             </w:r>
             <w:r>
+              <w:rPr>
+                <w:sz w:val="19"/>
+              </w:rPr>
               <w:t xml:space="preserve"> </w:t>
             </w:r>
             <w:r>
               <w:rPr>
                 <w:b/>
                 <w:bCs/>
+                <w:sz w:val="19"/>
               </w:rPr>
               <w:t xml:space="preserve">Attach</w:t>
             </w:r>
             <w:r>
+              <w:rPr>
+                <w:sz w:val="19"/>
+              </w:rPr>
               <w:t xml:space="preserve"> </w:t>
             </w:r>
             <w:r>
+              <w:rPr>
+                <w:sz w:val="19"/>
+              </w:rPr>
               <w:t xml:space="preserve">it again.</w:t>
             </w:r>
           </w:p>
@@ -6207,8 +6995,12 @@
           <w:p>
             <w:pPr>
               <w:pStyle w:val="Compact"/>
-            </w:pPr>
-            <w:r>
+              <w:spacing w:after="0" w:line="252" w:lineRule="auto"/>
+            </w:pPr>
+            <w:r>
+              <w:rPr>
+                <w:sz w:val="19"/>
+              </w:rPr>
               <w:t xml:space="preserve">Garment fits the wrong body</w:t>
             </w:r>
           </w:p>
@@ -6218,9 +7010,13 @@
           <w:p>
             <w:pPr>
               <w:pStyle w:val="Compact"/>
-            </w:pPr>
-            <w:r>
-              <w:t xml:space="preserve">Attach the variant (male or female) that matches the body you’re dressing (section 4).</w:t>
+              <w:spacing w:after="0" w:line="252" w:lineRule="auto"/>
+            </w:pPr>
+            <w:r>
+              <w:rPr>
+                <w:sz w:val="19"/>
+              </w:rPr>
+              <w:t xml:space="preserve">Attach the variant (male or female) that matches the body you're dressing (section 4).</w:t>
             </w:r>
           </w:p>
         </w:tc>
@@ -6231,18 +7027,26 @@
           <w:p>
             <w:pPr>
               <w:pStyle w:val="Compact"/>
+              <w:spacing w:after="0" w:line="252" w:lineRule="auto"/>
             </w:pPr>
             <w:r>
               <w:rPr>
                 <w:b/>
                 <w:bCs/>
+                <w:sz w:val="19"/>
               </w:rPr>
               <w:t xml:space="preserve">Publish</w:t>
             </w:r>
             <w:r>
+              <w:rPr>
+                <w:sz w:val="19"/>
+              </w:rPr>
               <w:t xml:space="preserve"> </w:t>
             </w:r>
             <w:r>
+              <w:rPr>
+                <w:sz w:val="19"/>
+              </w:rPr>
               <w:t xml:space="preserve">says no remote library is set</w:t>
             </w:r>
           </w:p>
@@ -6252,24 +7056,38 @@
           <w:p>
             <w:pPr>
               <w:pStyle w:val="Compact"/>
-            </w:pPr>
-            <w:r>
+              <w:spacing w:after="0" w:line="252" w:lineRule="auto"/>
+            </w:pPr>
+            <w:r>
+              <w:rPr>
+                <w:sz w:val="19"/>
+              </w:rPr>
               <w:t xml:space="preserve">Set the</w:t>
             </w:r>
             <w:r>
+              <w:rPr>
+                <w:sz w:val="19"/>
+              </w:rPr>
               <w:t xml:space="preserve"> </w:t>
             </w:r>
             <w:r>
               <w:rPr>
                 <w:b/>
                 <w:bCs/>
+                <w:sz w:val="19"/>
               </w:rPr>
               <w:t xml:space="preserve">Remote</w:t>
             </w:r>
             <w:r>
+              <w:rPr>
+                <w:sz w:val="19"/>
+              </w:rPr>
               <w:t xml:space="preserve"> </w:t>
             </w:r>
             <w:r>
+              <w:rPr>
+                <w:sz w:val="19"/>
+              </w:rPr>
               <w:t xml:space="preserve">folder on the Setup tab.</w:t>
             </w:r>
           </w:p>
@@ -6281,8 +7099,12 @@
           <w:p>
             <w:pPr>
               <w:pStyle w:val="Compact"/>
-            </w:pPr>
-            <w:r>
+              <w:spacing w:after="0" w:line="252" w:lineRule="auto"/>
+            </w:pPr>
+            <w:r>
+              <w:rPr>
+                <w:sz w:val="19"/>
+              </w:rPr>
               <w:t xml:space="preserve">Library is empty</w:t>
             </w:r>
           </w:p>
@@ -6292,37 +7114,58 @@
           <w:p>
             <w:pPr>
               <w:pStyle w:val="Compact"/>
-            </w:pPr>
-            <w:r>
+              <w:spacing w:after="0" w:line="252" w:lineRule="auto"/>
+            </w:pPr>
+            <w:r>
+              <w:rPr>
+                <w:sz w:val="19"/>
+              </w:rPr>
               <w:t xml:space="preserve">Set your</w:t>
             </w:r>
             <w:r>
+              <w:rPr>
+                <w:sz w:val="19"/>
+              </w:rPr>
               <w:t xml:space="preserve"> </w:t>
             </w:r>
             <w:r>
               <w:rPr>
                 <w:b/>
                 <w:bCs/>
+                <w:sz w:val="19"/>
               </w:rPr>
               <w:t xml:space="preserve">Local</w:t>
             </w:r>
             <w:r>
+              <w:rPr>
+                <w:sz w:val="19"/>
+              </w:rPr>
               <w:t xml:space="preserve"> </w:t>
             </w:r>
             <w:r>
+              <w:rPr>
+                <w:sz w:val="19"/>
+              </w:rPr>
               <w:t xml:space="preserve">folder on Setup to where your assets live, or</w:t>
             </w:r>
             <w:r>
+              <w:rPr>
+                <w:sz w:val="19"/>
+              </w:rPr>
               <w:t xml:space="preserve"> </w:t>
             </w:r>
             <w:r>
               <w:rPr>
                 <w:b/>
                 <w:bCs/>
+                <w:sz w:val="19"/>
               </w:rPr>
               <w:t xml:space="preserve">Sync from remote</w:t>
             </w:r>
             <w:r>
+              <w:rPr>
+                <w:sz w:val="19"/>
+              </w:rPr>
               <w:t xml:space="preserve">.</w:t>
             </w:r>
           </w:p>
@@ -6334,17 +7177,25 @@
           <w:p>
             <w:pPr>
               <w:pStyle w:val="Compact"/>
-            </w:pPr>
-            <w:r>
+              <w:spacing w:after="0" w:line="252" w:lineRule="auto"/>
+            </w:pPr>
+            <w:r>
+              <w:rPr>
+                <w:sz w:val="19"/>
+              </w:rPr>
               <w:t xml:space="preserve">A folder shows</w:t>
             </w:r>
             <w:r>
+              <w:rPr>
+                <w:sz w:val="19"/>
+              </w:rPr>
               <w:t xml:space="preserve"> </w:t>
             </w:r>
             <w:r>
               <w:rPr>
                 <w:b/>
                 <w:bCs/>
+                <w:sz w:val="19"/>
               </w:rPr>
               <w:t xml:space="preserve">(missing)</w:t>
             </w:r>
@@ -6355,9 +7206,13 @@
           <w:p>
             <w:pPr>
               <w:pStyle w:val="Compact"/>
-            </w:pPr>
-            <w:r>
-              <w:t xml:space="preserve">The drive or server isn’t mounted. Reconnect it, or pick a reachable folder.</w:t>
+              <w:spacing w:after="0" w:line="252" w:lineRule="auto"/>
+            </w:pPr>
+            <w:r>
+              <w:rPr>
+                <w:sz w:val="19"/>
+              </w:rPr>
+              <w:t xml:space="preserve">The drive or server isn't mounted. Reconnect it, or pick a reachable folder.</w:t>
             </w:r>
           </w:p>
         </w:tc>
@@ -6368,18 +7223,26 @@
           <w:p>
             <w:pPr>
               <w:pStyle w:val="Compact"/>
+              <w:spacing w:after="0" w:line="252" w:lineRule="auto"/>
             </w:pPr>
             <w:r>
               <w:rPr>
                 <w:b/>
                 <w:bCs/>
+                <w:sz w:val="19"/>
               </w:rPr>
               <w:t xml:space="preserve">Sync</w:t>
             </w:r>
             <w:r>
+              <w:rPr>
+                <w:sz w:val="19"/>
+              </w:rPr>
               <w:t xml:space="preserve"> </w:t>
             </w:r>
             <w:r>
+              <w:rPr>
+                <w:sz w:val="19"/>
+              </w:rPr>
               <w:t xml:space="preserve">button is greyed out</w:t>
             </w:r>
           </w:p>
@@ -6389,40 +7252,64 @@
           <w:p>
             <w:pPr>
               <w:pStyle w:val="Compact"/>
-            </w:pPr>
-            <w:r>
+              <w:spacing w:after="0" w:line="252" w:lineRule="auto"/>
+            </w:pPr>
+            <w:r>
+              <w:rPr>
+                <w:sz w:val="19"/>
+              </w:rPr>
               <w:t xml:space="preserve">Set both a</w:t>
             </w:r>
             <w:r>
+              <w:rPr>
+                <w:sz w:val="19"/>
+              </w:rPr>
               <w:t xml:space="preserve"> </w:t>
             </w:r>
             <w:r>
               <w:rPr>
                 <w:b/>
                 <w:bCs/>
+                <w:sz w:val="19"/>
               </w:rPr>
               <w:t xml:space="preserve">Local</w:t>
             </w:r>
             <w:r>
+              <w:rPr>
+                <w:sz w:val="19"/>
+              </w:rPr>
               <w:t xml:space="preserve"> </w:t>
             </w:r>
             <w:r>
+              <w:rPr>
+                <w:sz w:val="19"/>
+              </w:rPr>
               <w:t xml:space="preserve">and a</w:t>
             </w:r>
             <w:r>
+              <w:rPr>
+                <w:sz w:val="19"/>
+              </w:rPr>
               <w:t xml:space="preserve"> </w:t>
             </w:r>
             <w:r>
               <w:rPr>
                 <w:b/>
                 <w:bCs/>
+                <w:sz w:val="19"/>
               </w:rPr>
               <w:t xml:space="preserve">Remote</w:t>
             </w:r>
             <w:r>
+              <w:rPr>
+                <w:sz w:val="19"/>
+              </w:rPr>
               <w:t xml:space="preserve"> </w:t>
             </w:r>
             <w:r>
+              <w:rPr>
+                <w:sz w:val="19"/>
+              </w:rPr>
               <w:t xml:space="preserve">folder on Setup.</w:t>
             </w:r>
           </w:p>
@@ -6434,8 +7321,12 @@
           <w:p>
             <w:pPr>
               <w:pStyle w:val="Compact"/>
-            </w:pPr>
-            <w:r>
+              <w:spacing w:after="0" w:line="252" w:lineRule="auto"/>
+            </w:pPr>
+            <w:r>
+              <w:rPr>
+                <w:sz w:val="19"/>
+              </w:rPr>
               <w:t xml:space="preserve">Sync reports failures</w:t>
             </w:r>
           </w:p>
@@ -6445,20 +7336,27 @@
           <w:p>
             <w:pPr>
               <w:pStyle w:val="Compact"/>
-            </w:pPr>
-            <w:r>
-              <w:t xml:space="preserve">The remote isn’t reachable, or some files are locked; the summary gives the count, and everything it could copy still came down.</w:t>
+              <w:spacing w:after="0" w:line="252" w:lineRule="auto"/>
+            </w:pPr>
+            <w:r>
+              <w:rPr>
+                <w:sz w:val="19"/>
+              </w:rPr>
+              <w:t xml:space="preserve">The remote isn't reachable, or some files are locked; the summary gives the count, and everything it could copy still came down.</w:t>
             </w:r>
           </w:p>
         </w:tc>
       </w:tr>
     </w:tbl>
-    <w:bookmarkEnd w:id="48"/>
-    <w:bookmarkEnd w:id="49"/>
+    <w:bookmarkEnd w:id="57"/>
     <w:sectPr>
+      <w:footerReference r:id="rId9" w:type="default"/>
       <w:footnotePr>
         <w:numRestart w:val="eachSect"/>
       </w:footnotePr>
+      <w:pgSz w:h="15840" w:w="12240"/>
+      <w:pgMar w:bottom="1440" w:left="1440" w:right="1440" w:top="1440"/>
+      <w:titlePg/>
     </w:sectPr>
   </w:body>
 </w:document>
@@ -6466,6 +7364,60 @@
 
 <file path=word/comments.xml><?xml version="1.0" encoding="utf-8"?>
 <w:comments xmlns:w="http://schemas.openxmlformats.org/wordprocessingml/2006/main" xmlns:m="http://schemas.openxmlformats.org/officeDocument/2006/math" xmlns:r="http://schemas.openxmlformats.org/officeDocument/2006/relationships" xmlns:o="urn:schemas-microsoft-com:office:office" xmlns:v="urn:schemas-microsoft-com:vml" xmlns:w10="urn:schemas-microsoft-com:office:word" xmlns:a="http://schemas.openxmlformats.org/drawingml/2006/main" xmlns:pic="http://schemas.openxmlformats.org/drawingml/2006/picture" xmlns:wp="http://schemas.openxmlformats.org/drawingml/2006/wordprocessingDrawing"/>
+</file>
+
+<file path=word/footer1.xml><?xml version="1.0" encoding="utf-8"?>
+<w:ftr xmlns:m="http://schemas.openxmlformats.org/officeDocument/2006/math" xmlns:mc="http://schemas.openxmlformats.org/markup-compatibility/2006" xmlns:mo="http://schemas.microsoft.com/office/mac/office/2008/main" xmlns:mv="urn:schemas-microsoft-com:mac:vml" xmlns:o="urn:schemas-microsoft-com:office:office" xmlns:r="http://schemas.openxmlformats.org/officeDocument/2006/relationships" xmlns:v="urn:schemas-microsoft-com:vml" xmlns:w10="urn:schemas-microsoft-com:office:word" xmlns:w14="http://schemas.microsoft.com/office/word/2010/wordml" xmlns:w="http://schemas.openxmlformats.org/wordprocessingml/2006/main" xmlns:wne="http://schemas.microsoft.com/office/word/2006/wordml" xmlns:wp14="http://schemas.microsoft.com/office/word/2010/wordprocessingDrawing" xmlns:wp="http://schemas.openxmlformats.org/drawingml/2006/wordprocessingDrawing" xmlns:wpc="http://schemas.microsoft.com/office/word/2010/wordprocessingCanvas" xmlns:wpg="http://schemas.microsoft.com/office/word/2010/wordprocessingGroup" xmlns:wpi="http://schemas.microsoft.com/office/word/2010/wordprocessingInk" xmlns:wps="http://schemas.microsoft.com/office/word/2010/wordprocessingShape" mc:Ignorable="w14 wp14">
+  <w:p>
+    <w:pPr>
+      <w:pStyle w:val="Footer"/>
+      <w:jc w:val="right"/>
+    </w:pPr>
+    <w:r/>
+    <w:r>
+      <w:rPr>
+        <w:color w:val="595959"/>
+        <w:sz w:val="18"/>
+      </w:rPr>
+      <w:t xml:space="preserve">Outfitter Guide  ·  v1.3.0  ·  </w:t>
+    </w:r>
+    <w:r>
+      <w:rPr>
+        <w:color w:val="595959"/>
+        <w:sz w:val="18"/>
+      </w:rPr>
+      <w:fldChar w:fldCharType="begin"/>
+    </w:r>
+    <w:r>
+      <w:rPr>
+        <w:color w:val="595959"/>
+        <w:sz w:val="18"/>
+      </w:rPr>
+      <w:instrText xml:space="preserve"> PAGE </w:instrText>
+    </w:r>
+    <w:r>
+      <w:rPr>
+        <w:color w:val="595959"/>
+        <w:sz w:val="18"/>
+      </w:rPr>
+      <w:fldChar w:fldCharType="separate"/>
+    </w:r>
+    <w:r>
+      <w:rPr>
+        <w:color w:val="595959"/>
+        <w:sz w:val="18"/>
+      </w:rPr>
+      <w:t>1</w:t>
+    </w:r>
+    <w:r>
+      <w:rPr>
+        <w:color w:val="595959"/>
+        <w:sz w:val="18"/>
+      </w:rPr>
+      <w:fldChar w:fldCharType="end"/>
+    </w:r>
+  </w:p>
+</w:ftr>
 </file>
 
 <file path=word/footnotes.xml><?xml version="1.0" encoding="utf-8"?>
@@ -6997,6 +7949,14 @@
   <w:style w:default="1" w:styleId="Normal" w:type="paragraph">
     <w:name w:val="Normal"/>
     <w:qFormat/>
+    <w:pPr>
+      <w:spacing w:after="120" w:line="276" w:lineRule="auto"/>
+    </w:pPr>
+    <w:rPr>
+      <w:rFonts w:ascii="Calibri" w:cs="Calibri" w:eastAsia="Calibri" w:hAnsi="Calibri"/>
+      <w:color w:val="262626"/>
+      <w:sz w:val="22"/>
+    </w:rPr>
   </w:style>
   <w:style w:styleId="BodyText" w:type="paragraph">
     <w:name w:val="Body Text"/>
@@ -7004,21 +7964,24 @@
     <w:link w:val="BodyTextChar"/>
     <w:qFormat/>
     <w:pPr>
-      <w:spacing w:after="180" w:before="180"/>
+      <w:spacing w:after="120" w:before="0"/>
     </w:pPr>
   </w:style>
   <w:style w:customStyle="1" w:styleId="FirstParagraph" w:type="paragraph">
     <w:name w:val="First Paragraph"/>
-    <w:basedOn w:val="BodyText"/>
+    <w:basedOn w:val="Normal"/>
     <w:next w:val="BodyText"/>
     <w:qFormat/>
+    <w:pPr>
+      <w:spacing w:after="120" w:before="0"/>
+    </w:pPr>
   </w:style>
   <w:style w:customStyle="1" w:styleId="Compact" w:type="paragraph">
     <w:name w:val="Compact"/>
-    <w:basedOn w:val="BodyText"/>
+    <w:basedOn w:val="Normal"/>
     <w:qFormat/>
     <w:pPr>
-      <w:spacing w:after="36" w:before="36"/>
+      <w:spacing w:after="60" w:before="0"/>
     </w:pPr>
   </w:style>
   <w:style w:styleId="Title" w:type="paragraph">
@@ -7030,13 +7993,16 @@
     <w:qFormat/>
     <w:rsid w:val="00A10FD9"/>
     <w:pPr>
-      <w:spacing w:after="80" w:line="240" w:lineRule="auto"/>
+      <w:spacing w:after="120" w:before="3168" w:line="240" w:lineRule="auto"/>
       <w:contextualSpacing/>
-      <w:jc w:val="center"/>
+      <w:jc w:val="left"/>
+      <w:pBdr/>
     </w:pPr>
     <w:rPr>
-      <w:rFonts w:asciiTheme="majorHAnsi" w:cstheme="majorBidi" w:eastAsiaTheme="majorEastAsia" w:hAnsiTheme="majorHAnsi"/>
-      <w:sz w:val="56"/>
+      <w:rFonts w:ascii="Calibri Light" w:cs="Calibri Light" w:eastAsia="Calibri Light" w:hAnsi="Calibri Light"/>
+      <w:b w:val="0"/>
+      <w:color w:val="1F4E79"/>
+      <w:sz w:val="72"/>
       <w:szCs w:val="56"/>
     </w:rPr>
   </w:style>
@@ -7064,11 +8030,15 @@
       <w:numPr>
         <w:ilvl w:val="1"/>
       </w:numPr>
+      <w:spacing w:after="600"/>
+      <w:jc w:val="left"/>
     </w:pPr>
     <w:rPr>
-      <w:rFonts w:cstheme="majorBidi" w:eastAsiaTheme="majorEastAsia"/>
+      <w:rFonts w:ascii="Calibri Light" w:cs="Calibri Light" w:eastAsia="Calibri Light" w:hAnsi="Calibri Light"/>
+      <w:i w:val="0"/>
+      <w:color w:val="595959"/>
       <w:spacing w:val="15"/>
-      <w:sz w:val="28"/>
+      <w:sz w:val="32"/>
       <w:szCs w:val="28"/>
     </w:rPr>
   </w:style>
@@ -7108,9 +8078,11 @@
     <w:pPr>
       <w:keepNext/>
       <w:keepLines/>
+      <w:jc w:val="left"/>
     </w:pPr>
     <w:rPr>
-      <w:sz w:val="24"/>
+      <w:color w:val="595959"/>
+      <w:sz w:val="22"/>
       <w:szCs w:val="24"/>
     </w:rPr>
   </w:style>
@@ -7165,13 +8137,19 @@
     <w:pPr>
       <w:keepNext/>
       <w:keepLines/>
-      <w:spacing w:after="80" w:before="360"/>
+      <w:pageBreakBefore/>
+      <w:spacing w:after="280" w:before="0"/>
       <w:outlineLvl w:val="0"/>
+      <w:pBdr>
+        <w:bottom w:color="1F4E79" w:space="6" w:sz="8" w:val="single"/>
+      </w:pBdr>
     </w:pPr>
     <w:rPr>
-      <w:rFonts w:asciiTheme="majorHAnsi" w:cstheme="majorBidi" w:eastAsiaTheme="majorEastAsia" w:hAnsiTheme="majorHAnsi"/>
-      <w:color w:themeColor="accent1" w:themeShade="BF" w:val="0F4761"/>
-      <w:sz w:val="40"/>
+      <w:rFonts w:ascii="Calibri Light" w:cs="Calibri Light" w:eastAsia="Calibri Light" w:hAnsi="Calibri Light"/>
+      <w:b w:val="0"/>
+      <w:i w:val="0"/>
+      <w:color w:val="1F4E79"/>
+      <w:sz w:val="44"/>
       <w:szCs w:val="40"/>
     </w:rPr>
   </w:style>
@@ -7188,13 +8166,16 @@
     <w:pPr>
       <w:keepNext/>
       <w:keepLines/>
-      <w:spacing w:after="80" w:before="160"/>
+      <w:pageBreakBefore w:val="0"/>
+      <w:spacing w:after="120" w:before="360"/>
       <w:outlineLvl w:val="1"/>
     </w:pPr>
     <w:rPr>
-      <w:rFonts w:asciiTheme="majorHAnsi" w:cstheme="majorBidi" w:eastAsiaTheme="majorEastAsia" w:hAnsiTheme="majorHAnsi"/>
-      <w:color w:themeColor="accent1" w:themeShade="BF" w:val="0F4761"/>
-      <w:sz w:val="32"/>
+      <w:rFonts w:ascii="Calibri" w:cs="Calibri" w:eastAsia="Calibri" w:hAnsi="Calibri"/>
+      <w:b/>
+      <w:i w:val="0"/>
+      <w:color w:val="1F4E79"/>
+      <w:sz w:val="30"/>
       <w:szCs w:val="32"/>
     </w:rPr>
   </w:style>
@@ -7211,13 +8192,16 @@
     <w:pPr>
       <w:keepNext/>
       <w:keepLines/>
-      <w:spacing w:after="80" w:before="160"/>
+      <w:pageBreakBefore w:val="0"/>
+      <w:spacing w:after="80" w:before="240"/>
       <w:outlineLvl w:val="2"/>
     </w:pPr>
     <w:rPr>
-      <w:rFonts w:cstheme="majorBidi" w:eastAsiaTheme="majorEastAsia"/>
-      <w:color w:themeColor="accent1" w:themeShade="BF" w:val="0F4761"/>
-      <w:sz w:val="28"/>
+      <w:rFonts w:ascii="Calibri" w:cs="Calibri" w:eastAsia="Calibri" w:hAnsi="Calibri"/>
+      <w:b/>
+      <w:i w:val="0"/>
+      <w:color w:val="1F4E79"/>
+      <w:sz w:val="25"/>
       <w:szCs w:val="28"/>
     </w:rPr>
   </w:style>
@@ -7474,15 +8458,23 @@
   </w:style>
   <w:style w:styleId="BlockText" w:type="paragraph">
     <w:name w:val="Block Text"/>
-    <w:basedOn w:val="BodyText"/>
+    <w:basedOn w:val="Normal"/>
     <w:next w:val="BodyText"/>
     <w:uiPriority w:val="9"/>
     <w:unhideWhenUsed/>
     <w:qFormat/>
     <w:pPr>
-      <w:spacing w:after="100" w:before="100"/>
-      <w:ind w:firstLine="0" w:left="480" w:right="480"/>
+      <w:spacing w:after="200" w:before="120"/>
+      <w:ind w:firstLine="0" w:left="216" w:right="216"/>
+      <w:pBdr>
+        <w:left w:color="1F4E79" w:space="8" w:sz="24" w:val="single"/>
+      </w:pBdr>
+      <w:shd w:color="auto" w:fill="EAF1F8" w:val="clear"/>
     </w:pPr>
+    <w:rPr>
+      <w:i w:val="0"/>
+      <w:color w:val="262626"/>
+    </w:rPr>
   </w:style>
   <w:style w:styleId="FootnoteText" w:type="paragraph">
     <w:name w:val="Footnote Text"/>
@@ -7571,16 +8563,29 @@
   <w:style w:customStyle="1" w:styleId="ImageCaption" w:type="paragraph">
     <w:name w:val="Image Caption"/>
     <w:basedOn w:val="Caption"/>
+    <w:pPr>
+      <w:spacing w:after="240"/>
+      <w:jc w:val="center"/>
+    </w:pPr>
+    <w:rPr>
+      <w:i/>
+      <w:color w:val="595959"/>
+      <w:sz w:val="19"/>
+    </w:rPr>
   </w:style>
   <w:style w:customStyle="1" w:styleId="Figure" w:type="paragraph">
     <w:name w:val="Figure"/>
     <w:basedOn w:val="Normal"/>
+    <w:pPr>
+      <w:jc w:val="center"/>
+    </w:pPr>
   </w:style>
   <w:style w:customStyle="1" w:styleId="CaptionedFigure" w:type="paragraph">
     <w:name w:val="Captioned Figure"/>
     <w:basedOn w:val="Figure"/>
     <w:pPr>
       <w:keepNext/>
+      <w:jc w:val="center"/>
     </w:pPr>
   </w:style>
   <w:style w:customStyle="1" w:styleId="BodyTextChar" w:type="character">
@@ -7592,8 +8597,9 @@
     <w:name w:val="Verbatim Char"/>
     <w:basedOn w:val="BodyTextChar"/>
     <w:rPr>
-      <w:rFonts w:ascii="Consolas" w:hAnsi="Consolas"/>
-      <w:sz w:val="22"/>
+      <w:rFonts w:ascii="Consolas" w:cs="Consolas" w:eastAsia="Consolas" w:hAnsi="Consolas"/>
+      <w:color w:val="8B1A1A"/>
+      <w:sz w:val="19"/>
     </w:rPr>
   </w:style>
   <w:style w:customStyle="1" w:styleId="SectionNumber" w:type="character">
@@ -7611,7 +8617,7 @@
     <w:name w:val="Hyperlink"/>
     <w:basedOn w:val="BodyTextChar"/>
     <w:rPr>
-      <w:color w:themeColor="accent1" w:val="4F81BD"/>
+      <w:color w:val="1F4E79"/>
     </w:rPr>
   </w:style>
   <w:style w:styleId="TOCHeading" w:type="paragraph">
@@ -7622,6 +8628,7 @@
     <w:unhideWhenUsed/>
     <w:qFormat/>
     <w:pPr>
+      <w:pageBreakBefore w:val="0"/>
       <w:spacing w:before="240" w:line="259" w:lineRule="auto"/>
       <w:outlineLvl w:val="9"/>
     </w:pPr>
@@ -7632,13 +8639,24 @@
       <w:color w:themeColor="accent1" w:themeShade="BF" w:val="365F91"/>
     </w:rPr>
   </w:style>
-  <w:style w:type="paragraph" w:customStyle="1" w:styleId="SourceCode">
+  <w:style w:customStyle="1" w:styleId="SourceCode" w:type="paragraph">
     <w:name w:val="Source Code"/>
     <w:basedOn w:val="Normal"/>
-    <w:link w:val="VerbatimChar"/>
     <w:pPr>
-      <w:wordWrap w:val="off"/>
+      <w:spacing w:after="120" w:before="120" w:line="240" w:lineRule="auto"/>
+      <w:ind w:left="216"/>
+      <w:pBdr>
+        <w:top w:color="F3F3F3" w:space="4" w:sz="4" w:val="single"/>
+        <w:left w:color="F3F3F3" w:space="4" w:sz="4" w:val="single"/>
+        <w:bottom w:color="F3F3F3" w:space="4" w:sz="4" w:val="single"/>
+        <w:right w:color="F3F3F3" w:space="4" w:sz="4" w:val="single"/>
+      </w:pBdr>
+      <w:shd w:color="auto" w:fill="F3F3F3" w:val="clear"/>
     </w:pPr>
+    <w:rPr>
+      <w:rFonts w:ascii="Consolas" w:cs="Consolas" w:eastAsia="Consolas" w:hAnsi="Consolas"/>
+      <w:sz w:val="19"/>
+    </w:rPr>
   </w:style>
   <w:style w:type="character" w:customStyle="1" w:styleId="KeywordTok">
     <w:name w:val="KeywordTok"/>

</xml_diff>

<commit_message>
Rebuild Outfitter Guide.docx for 1.3.1
Co-Authored-By: Claude Opus 5.5 (1M context) <noreply@anthropic.com>
</commit_message>
<xml_diff>
--- a/Outfitter Guide.docx
+++ b/Outfitter Guide.docx
@@ -15,7 +15,7 @@
         <w:pStyle w:val="Subtitle"/>
       </w:pPr>
       <w:r>
-        <w:t xml:space="preserve">Maya 2026 clothing tool  ·  Version 1.3.0</w:t>
+        <w:t xml:space="preserve">Maya 2026 clothing tool  ·  Version 1.3.1</w:t>
       </w:r>
     </w:p>
     <w:p>
@@ -7379,7 +7379,7 @@
         <w:color w:val="595959"/>
         <w:sz w:val="18"/>
       </w:rPr>
-      <w:t xml:space="preserve">Outfitter Guide  ·  v1.3.0  ·  </w:t>
+      <w:t xml:space="preserve">Outfitter Guide  ·  v1.3.1  ·  </w:t>
     </w:r>
     <w:r>
       <w:rPr>

</xml_diff>

<commit_message>
Refresh thumbnails without replacing the open scene (1.3.2)
Refresh thumbnails used to open the asset's .ma in place of the user's scene and
leave it open, so a later save would overwrite the published asset. It now imports
the asset under a scratch namespace, captures it isolated, then removes everything
the import brought in and restores the scene's unsaved-changes flag. Cleanup runs
even when the capture fails.

Co-Authored-By: Claude Opus 5.5 (1M context) <noreply@anthropic.com>
</commit_message>
<xml_diff>
--- a/Outfitter Guide.docx
+++ b/Outfitter Guide.docx
@@ -15,7 +15,7 @@
         <w:pStyle w:val="Subtitle"/>
       </w:pPr>
       <w:r>
-        <w:t xml:space="preserve">Maya 2026 clothing tool  ·  Version 1.3.1</w:t>
+        <w:t xml:space="preserve">Maya 2026 clothing tool  ·  Version 1.3.2</w:t>
       </w:r>
     </w:p>
     <w:p>
@@ -3840,13 +3840,13 @@
         <w:t xml:space="preserve">↻ Refresh thumbnails</w:t>
       </w:r>
       <w:r>
-        <w:t xml:space="preserve">. It opens the asset in Maya, recaptures, and overwrites only the</w:t>
-      </w:r>
-      <w:r>
-        <w:t xml:space="preserve"> </w:t>
-      </w:r>
-      <w:r>
-        <w:t xml:space="preserve">two image files - the</w:t>
+        <w:t xml:space="preserve">. It brings the asset into your scene, recaptures, removes it</w:t>
+      </w:r>
+      <w:r>
+        <w:t xml:space="preserve"> </w:t>
+      </w:r>
+      <w:r>
+        <w:t xml:space="preserve">again, and overwrites only the two image files - the</w:t>
       </w:r>
       <w:r>
         <w:t xml:space="preserve"> </w:t>
@@ -3861,19 +3861,19 @@
         <w:t xml:space="preserve"> </w:t>
       </w:r>
       <w:r>
-        <w:t xml:space="preserve">and its details are untouched. The images go to your local copy</w:t>
-      </w:r>
-      <w:r>
-        <w:t xml:space="preserve"> </w:t>
-      </w:r>
-      <w:r>
-        <w:t xml:space="preserve">and, when a remote library is set and already holds the asset, to the shared copy too. It</w:t>
-      </w:r>
-      <w:r>
-        <w:t xml:space="preserve"> </w:t>
-      </w:r>
-      <w:r>
-        <w:t xml:space="preserve">replaces the current Maya scene, so save your work first.</w:t>
+        <w:t xml:space="preserve">and its details are untouched.</w:t>
+      </w:r>
+      <w:r>
+        <w:t xml:space="preserve"> </w:t>
+      </w:r>
+      <w:r>
+        <w:t xml:space="preserve">Your open scene is left as it was. The images go to your local copy and, when a remote</w:t>
+      </w:r>
+      <w:r>
+        <w:t xml:space="preserve"> </w:t>
+      </w:r>
+      <w:r>
+        <w:t xml:space="preserve">library is set and already holds the asset, to the shared copy too.</w:t>
       </w:r>
     </w:p>
     <w:bookmarkEnd w:id="48"/>
@@ -7379,7 +7379,7 @@
         <w:color w:val="595959"/>
         <w:sz w:val="18"/>
       </w:rPr>
-      <w:t xml:space="preserve">Outfitter Guide  ·  v1.3.1  ·  </w:t>
+      <w:t xml:space="preserve">Outfitter Guide  ·  v1.3.2  ·  </w:t>
     </w:r>
     <w:r>
       <w:rPr>

</xml_diff>